<commit_message>
update:document and read me
</commit_message>
<xml_diff>
--- a/Document/Protocol Document.docx
+++ b/Document/Protocol Document.docx
@@ -12,7 +12,7 @@
         </w:rPr>
       </w:pPr>
       <w:bookmarkStart w:id="0" w:name="_Toc231482646"/>
-      <w:bookmarkStart w:id="1" w:name="_Toc231485055"/>
+      <w:bookmarkStart w:id="1" w:name="_Toc233732719"/>
       <w:proofErr w:type="spellStart"/>
       <w:r>
         <w:rPr>
@@ -100,7 +100,7 @@
           <w:r>
             <w:fldChar w:fldCharType="separate"/>
           </w:r>
-          <w:hyperlink w:anchor="_Toc231485055" w:history="1">
+          <w:hyperlink w:anchor="_Toc233732719" w:history="1">
             <w:r>
               <w:rPr>
                 <w:rStyle w:val="ae"/>
@@ -137,7 +137,7 @@
                 <w:noProof/>
                 <w:webHidden/>
               </w:rPr>
-              <w:instrText>PAGEREF _Toc231485055 \h</w:instrText>
+              <w:instrText>PAGEREF _Toc233732719 \h</w:instrText>
             </w:r>
             <w:r>
               <w:rPr>
@@ -193,7 +193,7 @@
               <w14:ligatures w14:val="standardContextual"/>
             </w:rPr>
           </w:pPr>
-          <w:hyperlink w:anchor="_Toc231485056" w:history="1">
+          <w:hyperlink w:anchor="_Toc233732720" w:history="1">
             <w:r>
               <w:rPr>
                 <w:rStyle w:val="ae"/>
@@ -231,7 +231,7 @@
                 <w:noProof/>
                 <w:webHidden/>
               </w:rPr>
-              <w:instrText>PAGEREF _Toc231485056 \h</w:instrText>
+              <w:instrText>PAGEREF _Toc233732720 \h</w:instrText>
             </w:r>
             <w:r>
               <w:rPr>
@@ -287,7 +287,7 @@
               <w14:ligatures w14:val="standardContextual"/>
             </w:rPr>
           </w:pPr>
-          <w:hyperlink w:anchor="_Toc231485057" w:history="1">
+          <w:hyperlink w:anchor="_Toc233732721" w:history="1">
             <w:r>
               <w:rPr>
                 <w:rStyle w:val="ae"/>
@@ -324,7 +324,7 @@
                 <w:noProof/>
                 <w:webHidden/>
               </w:rPr>
-              <w:instrText>PAGEREF _Toc231485057 \h</w:instrText>
+              <w:instrText>PAGEREF _Toc233732721 \h</w:instrText>
             </w:r>
             <w:r>
               <w:rPr>
@@ -380,7 +380,7 @@
               <w14:ligatures w14:val="standardContextual"/>
             </w:rPr>
           </w:pPr>
-          <w:hyperlink w:anchor="_Toc231485058" w:history="1">
+          <w:hyperlink w:anchor="_Toc233732722" w:history="1">
             <w:r>
               <w:rPr>
                 <w:rStyle w:val="ae"/>
@@ -417,7 +417,7 @@
                 <w:noProof/>
                 <w:webHidden/>
               </w:rPr>
-              <w:instrText>PAGEREF _Toc231485058 \h</w:instrText>
+              <w:instrText>PAGEREF _Toc233732722 \h</w:instrText>
             </w:r>
             <w:r>
               <w:rPr>
@@ -473,7 +473,7 @@
               <w14:ligatures w14:val="standardContextual"/>
             </w:rPr>
           </w:pPr>
-          <w:hyperlink w:anchor="_Toc231485059" w:history="1">
+          <w:hyperlink w:anchor="_Toc233732723" w:history="1">
             <w:r>
               <w:rPr>
                 <w:rStyle w:val="ae"/>
@@ -510,7 +510,7 @@
                 <w:noProof/>
                 <w:webHidden/>
               </w:rPr>
-              <w:instrText>PAGEREF _Toc231485059 \h</w:instrText>
+              <w:instrText>PAGEREF _Toc233732723 \h</w:instrText>
             </w:r>
             <w:r>
               <w:rPr>
@@ -566,7 +566,7 @@
               <w14:ligatures w14:val="standardContextual"/>
             </w:rPr>
           </w:pPr>
-          <w:hyperlink w:anchor="_Toc231485060" w:history="1">
+          <w:hyperlink w:anchor="_Toc233732724" w:history="1">
             <w:r>
               <w:rPr>
                 <w:rStyle w:val="ae"/>
@@ -603,7 +603,7 @@
                 <w:noProof/>
                 <w:webHidden/>
               </w:rPr>
-              <w:instrText>PAGEREF _Toc231485060 \h</w:instrText>
+              <w:instrText>PAGEREF _Toc233732724 \h</w:instrText>
             </w:r>
             <w:r>
               <w:rPr>
@@ -659,7 +659,7 @@
               <w14:ligatures w14:val="standardContextual"/>
             </w:rPr>
           </w:pPr>
-          <w:hyperlink w:anchor="_Toc231485061" w:history="1">
+          <w:hyperlink w:anchor="_Toc233732725" w:history="1">
             <w:r>
               <w:rPr>
                 <w:rStyle w:val="ae"/>
@@ -696,7 +696,7 @@
                 <w:noProof/>
                 <w:webHidden/>
               </w:rPr>
-              <w:instrText>PAGEREF _Toc231485061 \h</w:instrText>
+              <w:instrText>PAGEREF _Toc233732725 \h</w:instrText>
             </w:r>
             <w:r>
               <w:rPr>
@@ -752,7 +752,7 @@
               <w14:ligatures w14:val="standardContextual"/>
             </w:rPr>
           </w:pPr>
-          <w:hyperlink w:anchor="_Toc231485062" w:history="1">
+          <w:hyperlink w:anchor="_Toc233732726" w:history="1">
             <w:r>
               <w:rPr>
                 <w:rStyle w:val="ae"/>
@@ -796,7 +796,7 @@
                 <w:noProof/>
                 <w:webHidden/>
               </w:rPr>
-              <w:instrText>PAGEREF _Toc231485062 \h</w:instrText>
+              <w:instrText>PAGEREF _Toc233732726 \h</w:instrText>
             </w:r>
             <w:r>
               <w:rPr>
@@ -852,7 +852,7 @@
               <w14:ligatures w14:val="standardContextual"/>
             </w:rPr>
           </w:pPr>
-          <w:hyperlink w:anchor="_Toc231485063" w:history="1">
+          <w:hyperlink w:anchor="_Toc233732727" w:history="1">
             <w:r>
               <w:rPr>
                 <w:rStyle w:val="ae"/>
@@ -889,7 +889,7 @@
                 <w:noProof/>
                 <w:webHidden/>
               </w:rPr>
-              <w:instrText>PAGEREF _Toc231485063 \h</w:instrText>
+              <w:instrText>PAGEREF _Toc233732727 \h</w:instrText>
             </w:r>
             <w:r>
               <w:rPr>
@@ -945,7 +945,7 @@
               <w14:ligatures w14:val="standardContextual"/>
             </w:rPr>
           </w:pPr>
-          <w:hyperlink w:anchor="_Toc231485064" w:history="1">
+          <w:hyperlink w:anchor="_Toc233732728" w:history="1">
             <w:r>
               <w:rPr>
                 <w:rStyle w:val="ae"/>
@@ -982,7 +982,7 @@
                 <w:noProof/>
                 <w:webHidden/>
               </w:rPr>
-              <w:instrText>PAGEREF _Toc231485064 \h</w:instrText>
+              <w:instrText>PAGEREF _Toc233732728 \h</w:instrText>
             </w:r>
             <w:r>
               <w:rPr>
@@ -1038,7 +1038,7 @@
               <w14:ligatures w14:val="standardContextual"/>
             </w:rPr>
           </w:pPr>
-          <w:hyperlink w:anchor="_Toc231485065" w:history="1">
+          <w:hyperlink w:anchor="_Toc233732729" w:history="1">
             <w:r>
               <w:rPr>
                 <w:rStyle w:val="ae"/>
@@ -1075,7 +1075,7 @@
                 <w:noProof/>
                 <w:webHidden/>
               </w:rPr>
-              <w:instrText>PAGEREF _Toc231485065 \h</w:instrText>
+              <w:instrText>PAGEREF _Toc233732729 \h</w:instrText>
             </w:r>
             <w:r>
               <w:rPr>
@@ -1131,7 +1131,7 @@
               <w14:ligatures w14:val="standardContextual"/>
             </w:rPr>
           </w:pPr>
-          <w:hyperlink w:anchor="_Toc231485066" w:history="1">
+          <w:hyperlink w:anchor="_Toc233732730" w:history="1">
             <w:r>
               <w:rPr>
                 <w:rStyle w:val="ae"/>
@@ -1168,7 +1168,7 @@
                 <w:noProof/>
                 <w:webHidden/>
               </w:rPr>
-              <w:instrText>PAGEREF _Toc231485066 \h</w:instrText>
+              <w:instrText>PAGEREF _Toc233732730 \h</w:instrText>
             </w:r>
             <w:r>
               <w:rPr>
@@ -1224,7 +1224,7 @@
               <w14:ligatures w14:val="standardContextual"/>
             </w:rPr>
           </w:pPr>
-          <w:hyperlink w:anchor="_Toc231485067" w:history="1">
+          <w:hyperlink w:anchor="_Toc233732731" w:history="1">
             <w:r>
               <w:rPr>
                 <w:rStyle w:val="ae"/>
@@ -1261,7 +1261,7 @@
                 <w:noProof/>
                 <w:webHidden/>
               </w:rPr>
-              <w:instrText>PAGEREF _Toc231485067 \h</w:instrText>
+              <w:instrText>PAGEREF _Toc233732731 \h</w:instrText>
             </w:r>
             <w:r>
               <w:rPr>
@@ -1317,7 +1317,7 @@
               <w14:ligatures w14:val="standardContextual"/>
             </w:rPr>
           </w:pPr>
-          <w:hyperlink w:anchor="_Toc231485068" w:history="1">
+          <w:hyperlink w:anchor="_Toc233732732" w:history="1">
             <w:r>
               <w:rPr>
                 <w:rStyle w:val="ae"/>
@@ -1354,7 +1354,7 @@
                 <w:noProof/>
                 <w:webHidden/>
               </w:rPr>
-              <w:instrText>PAGEREF _Toc231485068 \h</w:instrText>
+              <w:instrText>PAGEREF _Toc233732732 \h</w:instrText>
             </w:r>
             <w:r>
               <w:rPr>
@@ -1410,7 +1410,7 @@
               <w14:ligatures w14:val="standardContextual"/>
             </w:rPr>
           </w:pPr>
-          <w:hyperlink w:anchor="_Toc231485069" w:history="1">
+          <w:hyperlink w:anchor="_Toc233732733" w:history="1">
             <w:r>
               <w:rPr>
                 <w:rStyle w:val="ae"/>
@@ -1447,7 +1447,7 @@
                 <w:noProof/>
                 <w:webHidden/>
               </w:rPr>
-              <w:instrText>PAGEREF _Toc231485069 \h</w:instrText>
+              <w:instrText>PAGEREF _Toc233732733 \h</w:instrText>
             </w:r>
             <w:r>
               <w:rPr>
@@ -1503,7 +1503,7 @@
               <w14:ligatures w14:val="standardContextual"/>
             </w:rPr>
           </w:pPr>
-          <w:hyperlink w:anchor="_Toc231485070" w:history="1">
+          <w:hyperlink w:anchor="_Toc233732734" w:history="1">
             <w:r>
               <w:rPr>
                 <w:rStyle w:val="ae"/>
@@ -1540,7 +1540,7 @@
                 <w:noProof/>
                 <w:webHidden/>
               </w:rPr>
-              <w:instrText>PAGEREF _Toc231485070 \h</w:instrText>
+              <w:instrText>PAGEREF _Toc233732734 \h</w:instrText>
             </w:r>
             <w:r>
               <w:rPr>
@@ -1596,7 +1596,7 @@
               <w14:ligatures w14:val="standardContextual"/>
             </w:rPr>
           </w:pPr>
-          <w:hyperlink w:anchor="_Toc231485071" w:history="1">
+          <w:hyperlink w:anchor="_Toc233732735" w:history="1">
             <w:r>
               <w:rPr>
                 <w:rStyle w:val="ae"/>
@@ -1633,7 +1633,7 @@
                 <w:noProof/>
                 <w:webHidden/>
               </w:rPr>
-              <w:instrText>PAGEREF _Toc231485071 \h</w:instrText>
+              <w:instrText>PAGEREF _Toc233732735 \h</w:instrText>
             </w:r>
             <w:r>
               <w:rPr>
@@ -1689,7 +1689,7 @@
               <w14:ligatures w14:val="standardContextual"/>
             </w:rPr>
           </w:pPr>
-          <w:hyperlink w:anchor="_Toc231485072" w:history="1">
+          <w:hyperlink w:anchor="_Toc233732736" w:history="1">
             <w:r>
               <w:rPr>
                 <w:rStyle w:val="ae"/>
@@ -1726,7 +1726,7 @@
                 <w:noProof/>
                 <w:webHidden/>
               </w:rPr>
-              <w:instrText>PAGEREF _Toc231485072 \h</w:instrText>
+              <w:instrText>PAGEREF _Toc233732736 \h</w:instrText>
             </w:r>
             <w:r>
               <w:rPr>
@@ -1782,7 +1782,7 @@
               <w14:ligatures w14:val="standardContextual"/>
             </w:rPr>
           </w:pPr>
-          <w:hyperlink w:anchor="_Toc231485073" w:history="1">
+          <w:hyperlink w:anchor="_Toc233732737" w:history="1">
             <w:r>
               <w:rPr>
                 <w:rStyle w:val="ae"/>
@@ -1819,7 +1819,7 @@
                 <w:noProof/>
                 <w:webHidden/>
               </w:rPr>
-              <w:instrText>PAGEREF _Toc231485073 \h</w:instrText>
+              <w:instrText>PAGEREF _Toc233732737 \h</w:instrText>
             </w:r>
             <w:r>
               <w:rPr>
@@ -1875,7 +1875,7 @@
               <w14:ligatures w14:val="standardContextual"/>
             </w:rPr>
           </w:pPr>
-          <w:hyperlink w:anchor="_Toc231485074" w:history="1">
+          <w:hyperlink w:anchor="_Toc233732738" w:history="1">
             <w:r>
               <w:rPr>
                 <w:rStyle w:val="ae"/>
@@ -1912,7 +1912,7 @@
                 <w:noProof/>
                 <w:webHidden/>
               </w:rPr>
-              <w:instrText>PAGEREF _Toc231485074 \h</w:instrText>
+              <w:instrText>PAGEREF _Toc233732738 \h</w:instrText>
             </w:r>
             <w:r>
               <w:rPr>
@@ -1968,7 +1968,7 @@
               <w14:ligatures w14:val="standardContextual"/>
             </w:rPr>
           </w:pPr>
-          <w:hyperlink w:anchor="_Toc231485075" w:history="1">
+          <w:hyperlink w:anchor="_Toc233732739" w:history="1">
             <w:r>
               <w:rPr>
                 <w:rStyle w:val="ae"/>
@@ -2005,7 +2005,7 @@
                 <w:noProof/>
                 <w:webHidden/>
               </w:rPr>
-              <w:instrText>PAGEREF _Toc231485075 \h</w:instrText>
+              <w:instrText>PAGEREF _Toc233732739 \h</w:instrText>
             </w:r>
             <w:r>
               <w:rPr>
@@ -2061,7 +2061,7 @@
               <w14:ligatures w14:val="standardContextual"/>
             </w:rPr>
           </w:pPr>
-          <w:hyperlink w:anchor="_Toc231485076" w:history="1">
+          <w:hyperlink w:anchor="_Toc233732740" w:history="1">
             <w:r>
               <w:rPr>
                 <w:rStyle w:val="ae"/>
@@ -2098,7 +2098,7 @@
                 <w:noProof/>
                 <w:webHidden/>
               </w:rPr>
-              <w:instrText>PAGEREF _Toc231485076 \h</w:instrText>
+              <w:instrText>PAGEREF _Toc233732740 \h</w:instrText>
             </w:r>
             <w:r>
               <w:rPr>
@@ -2154,7 +2154,7 @@
               <w14:ligatures w14:val="standardContextual"/>
             </w:rPr>
           </w:pPr>
-          <w:hyperlink w:anchor="_Toc231485077" w:history="1">
+          <w:hyperlink w:anchor="_Toc233732741" w:history="1">
             <w:r>
               <w:rPr>
                 <w:rStyle w:val="ae"/>
@@ -2191,7 +2191,7 @@
                 <w:noProof/>
                 <w:webHidden/>
               </w:rPr>
-              <w:instrText>PAGEREF _Toc231485077 \h</w:instrText>
+              <w:instrText>PAGEREF _Toc233732741 \h</w:instrText>
             </w:r>
             <w:r>
               <w:rPr>
@@ -2247,7 +2247,7 @@
               <w14:ligatures w14:val="standardContextual"/>
             </w:rPr>
           </w:pPr>
-          <w:hyperlink w:anchor="_Toc231485078" w:history="1">
+          <w:hyperlink w:anchor="_Toc233732742" w:history="1">
             <w:r>
               <w:rPr>
                 <w:rStyle w:val="ae"/>
@@ -2284,7 +2284,7 @@
                 <w:noProof/>
                 <w:webHidden/>
               </w:rPr>
-              <w:instrText>PAGEREF _Toc231485078 \h</w:instrText>
+              <w:instrText>PAGEREF _Toc233732742 \h</w:instrText>
             </w:r>
             <w:r>
               <w:rPr>
@@ -2340,7 +2340,7 @@
               <w14:ligatures w14:val="standardContextual"/>
             </w:rPr>
           </w:pPr>
-          <w:hyperlink w:anchor="_Toc231485079" w:history="1">
+          <w:hyperlink w:anchor="_Toc233732743" w:history="1">
             <w:r>
               <w:rPr>
                 <w:rStyle w:val="ae"/>
@@ -2377,7 +2377,7 @@
                 <w:noProof/>
                 <w:webHidden/>
               </w:rPr>
-              <w:instrText>PAGEREF _Toc231485079 \h</w:instrText>
+              <w:instrText>PAGEREF _Toc233732743 \h</w:instrText>
             </w:r>
             <w:r>
               <w:rPr>
@@ -2433,7 +2433,7 @@
               <w14:ligatures w14:val="standardContextual"/>
             </w:rPr>
           </w:pPr>
-          <w:hyperlink w:anchor="_Toc231485080" w:history="1">
+          <w:hyperlink w:anchor="_Toc233732744" w:history="1">
             <w:r>
               <w:rPr>
                 <w:rStyle w:val="ae"/>
@@ -2470,7 +2470,7 @@
                 <w:noProof/>
                 <w:webHidden/>
               </w:rPr>
-              <w:instrText>PAGEREF _Toc231485080 \h</w:instrText>
+              <w:instrText>PAGEREF _Toc233732744 \h</w:instrText>
             </w:r>
             <w:r>
               <w:rPr>
@@ -2526,7 +2526,7 @@
               <w14:ligatures w14:val="standardContextual"/>
             </w:rPr>
           </w:pPr>
-          <w:hyperlink w:anchor="_Toc231485081" w:history="1">
+          <w:hyperlink w:anchor="_Toc233732745" w:history="1">
             <w:r>
               <w:rPr>
                 <w:rStyle w:val="ae"/>
@@ -2563,7 +2563,7 @@
                 <w:noProof/>
                 <w:webHidden/>
               </w:rPr>
-              <w:instrText>PAGEREF _Toc231485081 \h</w:instrText>
+              <w:instrText>PAGEREF _Toc233732745 \h</w:instrText>
             </w:r>
             <w:r>
               <w:rPr>
@@ -2619,7 +2619,7 @@
               <w14:ligatures w14:val="standardContextual"/>
             </w:rPr>
           </w:pPr>
-          <w:hyperlink w:anchor="_Toc231485082" w:history="1">
+          <w:hyperlink w:anchor="_Toc233732746" w:history="1">
             <w:r>
               <w:rPr>
                 <w:rStyle w:val="ae"/>
@@ -2656,7 +2656,7 @@
                 <w:noProof/>
                 <w:webHidden/>
               </w:rPr>
-              <w:instrText>PAGEREF _Toc231485082 \h</w:instrText>
+              <w:instrText>PAGEREF _Toc233732746 \h</w:instrText>
             </w:r>
             <w:r>
               <w:rPr>
@@ -2712,7 +2712,7 @@
               <w14:ligatures w14:val="standardContextual"/>
             </w:rPr>
           </w:pPr>
-          <w:hyperlink w:anchor="_Toc231485083" w:history="1">
+          <w:hyperlink w:anchor="_Toc233732747" w:history="1">
             <w:r>
               <w:rPr>
                 <w:rStyle w:val="ae"/>
@@ -2749,7 +2749,7 @@
                 <w:noProof/>
                 <w:webHidden/>
               </w:rPr>
-              <w:instrText>PAGEREF _Toc231485083 \h</w:instrText>
+              <w:instrText>PAGEREF _Toc233732747 \h</w:instrText>
             </w:r>
             <w:r>
               <w:rPr>
@@ -2805,7 +2805,7 @@
               <w14:ligatures w14:val="standardContextual"/>
             </w:rPr>
           </w:pPr>
-          <w:hyperlink w:anchor="_Toc231485084" w:history="1">
+          <w:hyperlink w:anchor="_Toc233732748" w:history="1">
             <w:r>
               <w:rPr>
                 <w:rStyle w:val="ae"/>
@@ -2842,7 +2842,7 @@
                 <w:noProof/>
                 <w:webHidden/>
               </w:rPr>
-              <w:instrText>PAGEREF _Toc231485084 \h</w:instrText>
+              <w:instrText>PAGEREF _Toc233732748 \h</w:instrText>
             </w:r>
             <w:r>
               <w:rPr>
@@ -2898,7 +2898,7 @@
               <w14:ligatures w14:val="standardContextual"/>
             </w:rPr>
           </w:pPr>
-          <w:hyperlink w:anchor="_Toc231485085" w:history="1">
+          <w:hyperlink w:anchor="_Toc233732749" w:history="1">
             <w:r>
               <w:rPr>
                 <w:rStyle w:val="ae"/>
@@ -2935,7 +2935,7 @@
                 <w:noProof/>
                 <w:webHidden/>
               </w:rPr>
-              <w:instrText>PAGEREF _Toc231485085 \h</w:instrText>
+              <w:instrText>PAGEREF _Toc233732749 \h</w:instrText>
             </w:r>
             <w:r>
               <w:rPr>
@@ -2991,7 +2991,7 @@
               <w14:ligatures w14:val="standardContextual"/>
             </w:rPr>
           </w:pPr>
-          <w:hyperlink w:anchor="_Toc231485086" w:history="1">
+          <w:hyperlink w:anchor="_Toc233732750" w:history="1">
             <w:r>
               <w:rPr>
                 <w:rStyle w:val="ae"/>
@@ -3028,7 +3028,7 @@
                 <w:noProof/>
                 <w:webHidden/>
               </w:rPr>
-              <w:instrText>PAGEREF _Toc231485086 \h</w:instrText>
+              <w:instrText>PAGEREF _Toc233732750 \h</w:instrText>
             </w:r>
             <w:r>
               <w:rPr>
@@ -3084,7 +3084,7 @@
               <w14:ligatures w14:val="standardContextual"/>
             </w:rPr>
           </w:pPr>
-          <w:hyperlink w:anchor="_Toc231485087" w:history="1">
+          <w:hyperlink w:anchor="_Toc233732751" w:history="1">
             <w:r>
               <w:rPr>
                 <w:rStyle w:val="ae"/>
@@ -3121,7 +3121,7 @@
                 <w:noProof/>
                 <w:webHidden/>
               </w:rPr>
-              <w:instrText>PAGEREF _Toc231485087 \h</w:instrText>
+              <w:instrText>PAGEREF _Toc233732751 \h</w:instrText>
             </w:r>
             <w:r>
               <w:rPr>
@@ -3177,7 +3177,7 @@
               <w14:ligatures w14:val="standardContextual"/>
             </w:rPr>
           </w:pPr>
-          <w:hyperlink w:anchor="_Toc231485088" w:history="1">
+          <w:hyperlink w:anchor="_Toc233732752" w:history="1">
             <w:r>
               <w:rPr>
                 <w:rStyle w:val="ae"/>
@@ -3214,7 +3214,7 @@
                 <w:noProof/>
                 <w:webHidden/>
               </w:rPr>
-              <w:instrText>PAGEREF _Toc231485088 \h</w:instrText>
+              <w:instrText>PAGEREF _Toc233732752 \h</w:instrText>
             </w:r>
             <w:r>
               <w:rPr>
@@ -3270,7 +3270,7 @@
               <w14:ligatures w14:val="standardContextual"/>
             </w:rPr>
           </w:pPr>
-          <w:hyperlink w:anchor="_Toc231485089" w:history="1">
+          <w:hyperlink w:anchor="_Toc233732753" w:history="1">
             <w:r>
               <w:rPr>
                 <w:rStyle w:val="ae"/>
@@ -3307,7 +3307,7 @@
                 <w:noProof/>
                 <w:webHidden/>
               </w:rPr>
-              <w:instrText>PAGEREF _Toc231485089 \h</w:instrText>
+              <w:instrText>PAGEREF _Toc233732753 \h</w:instrText>
             </w:r>
             <w:r>
               <w:rPr>
@@ -3363,7 +3363,7 @@
               <w14:ligatures w14:val="standardContextual"/>
             </w:rPr>
           </w:pPr>
-          <w:hyperlink w:anchor="_Toc231485090" w:history="1">
+          <w:hyperlink w:anchor="_Toc233732754" w:history="1">
             <w:r>
               <w:rPr>
                 <w:rStyle w:val="ae"/>
@@ -3400,7 +3400,7 @@
                 <w:noProof/>
                 <w:webHidden/>
               </w:rPr>
-              <w:instrText>PAGEREF _Toc231485090 \h</w:instrText>
+              <w:instrText>PAGEREF _Toc233732754 \h</w:instrText>
             </w:r>
             <w:r>
               <w:rPr>
@@ -3456,7 +3456,7 @@
               <w14:ligatures w14:val="standardContextual"/>
             </w:rPr>
           </w:pPr>
-          <w:hyperlink w:anchor="_Toc231485091" w:history="1">
+          <w:hyperlink w:anchor="_Toc233732755" w:history="1">
             <w:r>
               <w:rPr>
                 <w:rStyle w:val="ae"/>
@@ -3493,7 +3493,7 @@
                 <w:noProof/>
                 <w:webHidden/>
               </w:rPr>
-              <w:instrText>PAGEREF _Toc231485091 \h</w:instrText>
+              <w:instrText>PAGEREF _Toc233732755 \h</w:instrText>
             </w:r>
             <w:r>
               <w:rPr>
@@ -3549,7 +3549,7 @@
               <w14:ligatures w14:val="standardContextual"/>
             </w:rPr>
           </w:pPr>
-          <w:hyperlink w:anchor="_Toc231485092" w:history="1">
+          <w:hyperlink w:anchor="_Toc233732756" w:history="1">
             <w:r>
               <w:rPr>
                 <w:rStyle w:val="ae"/>
@@ -3586,7 +3586,7 @@
                 <w:noProof/>
                 <w:webHidden/>
               </w:rPr>
-              <w:instrText>PAGEREF _Toc231485092 \h</w:instrText>
+              <w:instrText>PAGEREF _Toc233732756 \h</w:instrText>
             </w:r>
             <w:r>
               <w:rPr>
@@ -3642,7 +3642,7 @@
               <w14:ligatures w14:val="standardContextual"/>
             </w:rPr>
           </w:pPr>
-          <w:hyperlink w:anchor="_Toc231485093" w:history="1">
+          <w:hyperlink w:anchor="_Toc233732757" w:history="1">
             <w:r>
               <w:rPr>
                 <w:rStyle w:val="ae"/>
@@ -3679,7 +3679,7 @@
                 <w:noProof/>
                 <w:webHidden/>
               </w:rPr>
-              <w:instrText>PAGEREF _Toc231485093 \h</w:instrText>
+              <w:instrText>PAGEREF _Toc233732757 \h</w:instrText>
             </w:r>
             <w:r>
               <w:rPr>
@@ -3735,7 +3735,7 @@
               <w14:ligatures w14:val="standardContextual"/>
             </w:rPr>
           </w:pPr>
-          <w:hyperlink w:anchor="_Toc231485094" w:history="1">
+          <w:hyperlink w:anchor="_Toc233732758" w:history="1">
             <w:r>
               <w:rPr>
                 <w:rStyle w:val="ae"/>
@@ -3772,7 +3772,7 @@
                 <w:noProof/>
                 <w:webHidden/>
               </w:rPr>
-              <w:instrText>PAGEREF _Toc231485094 \h</w:instrText>
+              <w:instrText>PAGEREF _Toc233732758 \h</w:instrText>
             </w:r>
             <w:r>
               <w:rPr>
@@ -3828,7 +3828,7 @@
               <w14:ligatures w14:val="standardContextual"/>
             </w:rPr>
           </w:pPr>
-          <w:hyperlink w:anchor="_Toc231485095" w:history="1">
+          <w:hyperlink w:anchor="_Toc233732759" w:history="1">
             <w:r>
               <w:rPr>
                 <w:rStyle w:val="ae"/>
@@ -3865,7 +3865,193 @@
                 <w:noProof/>
                 <w:webHidden/>
               </w:rPr>
-              <w:instrText>PAGEREF _Toc231485095 \h</w:instrText>
+              <w:instrText>PAGEREF _Toc233732759 \h</w:instrText>
+            </w:r>
+            <w:r>
+              <w:rPr>
+                <w:rFonts w:hint="eastAsia"/>
+                <w:noProof/>
+                <w:webHidden/>
+              </w:rPr>
+              <w:instrText xml:space="preserve"> </w:instrText>
+            </w:r>
+            <w:r>
+              <w:rPr>
+                <w:rFonts w:hint="eastAsia"/>
+                <w:noProof/>
+                <w:webHidden/>
+              </w:rPr>
+            </w:r>
+            <w:r>
+              <w:rPr>
+                <w:rFonts w:hint="eastAsia"/>
+                <w:noProof/>
+                <w:webHidden/>
+              </w:rPr>
+              <w:fldChar w:fldCharType="separate"/>
+            </w:r>
+            <w:r>
+              <w:rPr>
+                <w:noProof/>
+                <w:webHidden/>
+              </w:rPr>
+              <w:t>21</w:t>
+            </w:r>
+            <w:r>
+              <w:rPr>
+                <w:rFonts w:hint="eastAsia"/>
+                <w:noProof/>
+                <w:webHidden/>
+              </w:rPr>
+              <w:fldChar w:fldCharType="end"/>
+            </w:r>
+          </w:hyperlink>
+        </w:p>
+        <w:p>
+          <w:pPr>
+            <w:pStyle w:val="TOC2"/>
+            <w:tabs>
+              <w:tab w:val="right" w:leader="dot" w:pos="8296"/>
+            </w:tabs>
+            <w:rPr>
+              <w:rFonts w:hint="eastAsia"/>
+              <w:noProof/>
+              <w:sz w:val="22"/>
+              <w:szCs w:val="24"/>
+              <w14:ligatures w14:val="standardContextual"/>
+            </w:rPr>
+          </w:pPr>
+          <w:hyperlink w:anchor="_Toc233732760" w:history="1">
+            <w:r>
+              <w:rPr>
+                <w:rStyle w:val="ae"/>
+                <w:noProof/>
+              </w:rPr>
+              <w:t>1.11 SCTE-35</w:t>
+            </w:r>
+            <w:r>
+              <w:rPr>
+                <w:rFonts w:hint="eastAsia"/>
+                <w:noProof/>
+                <w:webHidden/>
+              </w:rPr>
+              <w:tab/>
+            </w:r>
+            <w:r>
+              <w:rPr>
+                <w:rFonts w:hint="eastAsia"/>
+                <w:noProof/>
+                <w:webHidden/>
+              </w:rPr>
+              <w:fldChar w:fldCharType="begin"/>
+            </w:r>
+            <w:r>
+              <w:rPr>
+                <w:rFonts w:hint="eastAsia"/>
+                <w:noProof/>
+                <w:webHidden/>
+              </w:rPr>
+              <w:instrText xml:space="preserve"> </w:instrText>
+            </w:r>
+            <w:r>
+              <w:rPr>
+                <w:noProof/>
+                <w:webHidden/>
+              </w:rPr>
+              <w:instrText>PAGEREF _Toc233732760 \h</w:instrText>
+            </w:r>
+            <w:r>
+              <w:rPr>
+                <w:rFonts w:hint="eastAsia"/>
+                <w:noProof/>
+                <w:webHidden/>
+              </w:rPr>
+              <w:instrText xml:space="preserve"> </w:instrText>
+            </w:r>
+            <w:r>
+              <w:rPr>
+                <w:rFonts w:hint="eastAsia"/>
+                <w:noProof/>
+                <w:webHidden/>
+              </w:rPr>
+            </w:r>
+            <w:r>
+              <w:rPr>
+                <w:rFonts w:hint="eastAsia"/>
+                <w:noProof/>
+                <w:webHidden/>
+              </w:rPr>
+              <w:fldChar w:fldCharType="separate"/>
+            </w:r>
+            <w:r>
+              <w:rPr>
+                <w:noProof/>
+                <w:webHidden/>
+              </w:rPr>
+              <w:t>21</w:t>
+            </w:r>
+            <w:r>
+              <w:rPr>
+                <w:rFonts w:hint="eastAsia"/>
+                <w:noProof/>
+                <w:webHidden/>
+              </w:rPr>
+              <w:fldChar w:fldCharType="end"/>
+            </w:r>
+          </w:hyperlink>
+        </w:p>
+        <w:p>
+          <w:pPr>
+            <w:pStyle w:val="TOC3"/>
+            <w:tabs>
+              <w:tab w:val="right" w:leader="dot" w:pos="8296"/>
+            </w:tabs>
+            <w:rPr>
+              <w:rFonts w:hint="eastAsia"/>
+              <w:noProof/>
+              <w:sz w:val="22"/>
+              <w:szCs w:val="24"/>
+              <w14:ligatures w14:val="standardContextual"/>
+            </w:rPr>
+          </w:pPr>
+          <w:hyperlink w:anchor="_Toc233732761" w:history="1">
+            <w:r>
+              <w:rPr>
+                <w:rStyle w:val="ae"/>
+                <w:noProof/>
+              </w:rPr>
+              <w:t>1.11.1 Request</w:t>
+            </w:r>
+            <w:r>
+              <w:rPr>
+                <w:rFonts w:hint="eastAsia"/>
+                <w:noProof/>
+                <w:webHidden/>
+              </w:rPr>
+              <w:tab/>
+            </w:r>
+            <w:r>
+              <w:rPr>
+                <w:rFonts w:hint="eastAsia"/>
+                <w:noProof/>
+                <w:webHidden/>
+              </w:rPr>
+              <w:fldChar w:fldCharType="begin"/>
+            </w:r>
+            <w:r>
+              <w:rPr>
+                <w:rFonts w:hint="eastAsia"/>
+                <w:noProof/>
+                <w:webHidden/>
+              </w:rPr>
+              <w:instrText xml:space="preserve"> </w:instrText>
+            </w:r>
+            <w:r>
+              <w:rPr>
+                <w:noProof/>
+                <w:webHidden/>
+              </w:rPr>
+              <w:instrText>PAGEREF _Toc233732761 \h</w:instrText>
             </w:r>
             <w:r>
               <w:rPr>
@@ -3921,7 +4107,7 @@
               <w14:ligatures w14:val="standardContextual"/>
             </w:rPr>
           </w:pPr>
-          <w:hyperlink w:anchor="_Toc231485096" w:history="1">
+          <w:hyperlink w:anchor="_Toc233732762" w:history="1">
             <w:r>
               <w:rPr>
                 <w:rStyle w:val="ae"/>
@@ -3965,7 +4151,7 @@
                 <w:noProof/>
                 <w:webHidden/>
               </w:rPr>
-              <w:instrText>PAGEREF _Toc231485096 \h</w:instrText>
+              <w:instrText>PAGEREF _Toc233732762 \h</w:instrText>
             </w:r>
             <w:r>
               <w:rPr>
@@ -3995,7 +4181,7 @@
                 <w:noProof/>
                 <w:webHidden/>
               </w:rPr>
-              <w:t>21</w:t>
+              <w:t>22</w:t>
             </w:r>
             <w:r>
               <w:rPr>
@@ -4021,7 +4207,7 @@
               <w14:ligatures w14:val="standardContextual"/>
             </w:rPr>
           </w:pPr>
-          <w:hyperlink w:anchor="_Toc231485097" w:history="1">
+          <w:hyperlink w:anchor="_Toc233732763" w:history="1">
             <w:r>
               <w:rPr>
                 <w:rStyle w:val="ae"/>
@@ -4058,7 +4244,7 @@
                 <w:noProof/>
                 <w:webHidden/>
               </w:rPr>
-              <w:instrText>PAGEREF _Toc231485097 \h</w:instrText>
+              <w:instrText>PAGEREF _Toc233732763 \h</w:instrText>
             </w:r>
             <w:r>
               <w:rPr>
@@ -4088,7 +4274,7 @@
                 <w:noProof/>
                 <w:webHidden/>
               </w:rPr>
-              <w:t>21</w:t>
+              <w:t>22</w:t>
             </w:r>
             <w:r>
               <w:rPr>
@@ -4114,7 +4300,7 @@
               <w14:ligatures w14:val="standardContextual"/>
             </w:rPr>
           </w:pPr>
-          <w:hyperlink w:anchor="_Toc231485098" w:history="1">
+          <w:hyperlink w:anchor="_Toc233732764" w:history="1">
             <w:r>
               <w:rPr>
                 <w:rStyle w:val="ae"/>
@@ -4151,7 +4337,7 @@
                 <w:noProof/>
                 <w:webHidden/>
               </w:rPr>
-              <w:instrText>PAGEREF _Toc231485098 \h</w:instrText>
+              <w:instrText>PAGEREF _Toc233732764 \h</w:instrText>
             </w:r>
             <w:r>
               <w:rPr>
@@ -4181,7 +4367,7 @@
                 <w:noProof/>
                 <w:webHidden/>
               </w:rPr>
-              <w:t>21</w:t>
+              <w:t>22</w:t>
             </w:r>
             <w:r>
               <w:rPr>
@@ -4207,7 +4393,7 @@
               <w14:ligatures w14:val="standardContextual"/>
             </w:rPr>
           </w:pPr>
-          <w:hyperlink w:anchor="_Toc231485099" w:history="1">
+          <w:hyperlink w:anchor="_Toc233732765" w:history="1">
             <w:r>
               <w:rPr>
                 <w:rStyle w:val="ae"/>
@@ -4251,7 +4437,7 @@
                 <w:noProof/>
                 <w:webHidden/>
               </w:rPr>
-              <w:instrText>PAGEREF _Toc231485099 \h</w:instrText>
+              <w:instrText>PAGEREF _Toc233732765 \h</w:instrText>
             </w:r>
             <w:r>
               <w:rPr>
@@ -4281,7 +4467,7 @@
                 <w:noProof/>
                 <w:webHidden/>
               </w:rPr>
-              <w:t>22</w:t>
+              <w:t>23</w:t>
             </w:r>
             <w:r>
               <w:rPr>
@@ -4307,7 +4493,7 @@
               <w14:ligatures w14:val="standardContextual"/>
             </w:rPr>
           </w:pPr>
-          <w:hyperlink w:anchor="_Toc231485100" w:history="1">
+          <w:hyperlink w:anchor="_Toc233732766" w:history="1">
             <w:r>
               <w:rPr>
                 <w:rStyle w:val="ae"/>
@@ -4344,7 +4530,7 @@
                 <w:noProof/>
                 <w:webHidden/>
               </w:rPr>
-              <w:instrText>PAGEREF _Toc231485100 \h</w:instrText>
+              <w:instrText>PAGEREF _Toc233732766 \h</w:instrText>
             </w:r>
             <w:r>
               <w:rPr>
@@ -4374,7 +4560,7 @@
                 <w:noProof/>
                 <w:webHidden/>
               </w:rPr>
-              <w:t>22</w:t>
+              <w:t>23</w:t>
             </w:r>
             <w:r>
               <w:rPr>
@@ -4400,7 +4586,7 @@
               <w14:ligatures w14:val="standardContextual"/>
             </w:rPr>
           </w:pPr>
-          <w:hyperlink w:anchor="_Toc231485101" w:history="1">
+          <w:hyperlink w:anchor="_Toc233732767" w:history="1">
             <w:r>
               <w:rPr>
                 <w:rStyle w:val="ae"/>
@@ -4437,7 +4623,7 @@
                 <w:noProof/>
                 <w:webHidden/>
               </w:rPr>
-              <w:instrText>PAGEREF _Toc231485101 \h</w:instrText>
+              <w:instrText>PAGEREF _Toc233732767 \h</w:instrText>
             </w:r>
             <w:r>
               <w:rPr>
@@ -4467,7 +4653,7 @@
                 <w:noProof/>
                 <w:webHidden/>
               </w:rPr>
-              <w:t>22</w:t>
+              <w:t>23</w:t>
             </w:r>
             <w:r>
               <w:rPr>
@@ -4493,7 +4679,7 @@
               <w14:ligatures w14:val="standardContextual"/>
             </w:rPr>
           </w:pPr>
-          <w:hyperlink w:anchor="_Toc231485102" w:history="1">
+          <w:hyperlink w:anchor="_Toc233732768" w:history="1">
             <w:r>
               <w:rPr>
                 <w:rStyle w:val="ae"/>
@@ -4530,7 +4716,7 @@
                 <w:noProof/>
                 <w:webHidden/>
               </w:rPr>
-              <w:instrText>PAGEREF _Toc231485102 \h</w:instrText>
+              <w:instrText>PAGEREF _Toc233732768 \h</w:instrText>
             </w:r>
             <w:r>
               <w:rPr>
@@ -4560,7 +4746,7 @@
                 <w:noProof/>
                 <w:webHidden/>
               </w:rPr>
-              <w:t>22</w:t>
+              <w:t>23</w:t>
             </w:r>
             <w:r>
               <w:rPr>
@@ -4586,7 +4772,7 @@
               <w14:ligatures w14:val="standardContextual"/>
             </w:rPr>
           </w:pPr>
-          <w:hyperlink w:anchor="_Toc231485103" w:history="1">
+          <w:hyperlink w:anchor="_Toc233732769" w:history="1">
             <w:r>
               <w:rPr>
                 <w:rStyle w:val="ae"/>
@@ -4623,7 +4809,7 @@
                 <w:noProof/>
                 <w:webHidden/>
               </w:rPr>
-              <w:instrText>PAGEREF _Toc231485103 \h</w:instrText>
+              <w:instrText>PAGEREF _Toc233732769 \h</w:instrText>
             </w:r>
             <w:r>
               <w:rPr>
@@ -4653,7 +4839,7 @@
                 <w:noProof/>
                 <w:webHidden/>
               </w:rPr>
-              <w:t>22</w:t>
+              <w:t>23</w:t>
             </w:r>
             <w:r>
               <w:rPr>
@@ -4679,7 +4865,7 @@
               <w14:ligatures w14:val="standardContextual"/>
             </w:rPr>
           </w:pPr>
-          <w:hyperlink w:anchor="_Toc231485104" w:history="1">
+          <w:hyperlink w:anchor="_Toc233732770" w:history="1">
             <w:r>
               <w:rPr>
                 <w:rStyle w:val="ae"/>
@@ -4723,7 +4909,7 @@
                 <w:noProof/>
                 <w:webHidden/>
               </w:rPr>
-              <w:instrText>PAGEREF _Toc231485104 \h</w:instrText>
+              <w:instrText>PAGEREF _Toc233732770 \h</w:instrText>
             </w:r>
             <w:r>
               <w:rPr>
@@ -4753,7 +4939,7 @@
                 <w:noProof/>
                 <w:webHidden/>
               </w:rPr>
-              <w:t>22</w:t>
+              <w:t>23</w:t>
             </w:r>
             <w:r>
               <w:rPr>
@@ -4779,7 +4965,7 @@
               <w14:ligatures w14:val="standardContextual"/>
             </w:rPr>
           </w:pPr>
-          <w:hyperlink w:anchor="_Toc231485105" w:history="1">
+          <w:hyperlink w:anchor="_Toc233732771" w:history="1">
             <w:r>
               <w:rPr>
                 <w:rStyle w:val="ae"/>
@@ -4823,7 +5009,7 @@
                 <w:noProof/>
                 <w:webHidden/>
               </w:rPr>
-              <w:instrText>PAGEREF _Toc231485105 \h</w:instrText>
+              <w:instrText>PAGEREF _Toc233732771 \h</w:instrText>
             </w:r>
             <w:r>
               <w:rPr>
@@ -4879,7 +5065,7 @@
               <w14:ligatures w14:val="standardContextual"/>
             </w:rPr>
           </w:pPr>
-          <w:hyperlink w:anchor="_Toc231485106" w:history="1">
+          <w:hyperlink w:anchor="_Toc233732772" w:history="1">
             <w:r>
               <w:rPr>
                 <w:rStyle w:val="ae"/>
@@ -4916,7 +5102,7 @@
                 <w:noProof/>
                 <w:webHidden/>
               </w:rPr>
-              <w:instrText>PAGEREF _Toc231485106 \h</w:instrText>
+              <w:instrText>PAGEREF _Toc233732772 \h</w:instrText>
             </w:r>
             <w:r>
               <w:rPr>
@@ -4946,7 +5132,7 @@
                 <w:noProof/>
                 <w:webHidden/>
               </w:rPr>
-              <w:t>23</w:t>
+              <w:t>24</w:t>
             </w:r>
             <w:r>
               <w:rPr>
@@ -4972,7 +5158,7 @@
               <w14:ligatures w14:val="standardContextual"/>
             </w:rPr>
           </w:pPr>
-          <w:hyperlink w:anchor="_Toc231485107" w:history="1">
+          <w:hyperlink w:anchor="_Toc233732773" w:history="1">
             <w:r>
               <w:rPr>
                 <w:rStyle w:val="ae"/>
@@ -5009,7 +5195,7 @@
                 <w:noProof/>
                 <w:webHidden/>
               </w:rPr>
-              <w:instrText>PAGEREF _Toc231485107 \h</w:instrText>
+              <w:instrText>PAGEREF _Toc233732773 \h</w:instrText>
             </w:r>
             <w:r>
               <w:rPr>
@@ -5039,7 +5225,7 @@
                 <w:noProof/>
                 <w:webHidden/>
               </w:rPr>
-              <w:t>23</w:t>
+              <w:t>24</w:t>
             </w:r>
             <w:r>
               <w:rPr>
@@ -5306,24 +5492,7 @@
     <w:p>
       <w:pPr>
         <w:rPr>
-          <w:b/>
-          <w:bCs/>
-          <w:lang w:val="zh-CN"/>
-        </w:rPr>
-      </w:pPr>
-    </w:p>
-    <w:p>
-      <w:pPr>
-        <w:rPr>
-          <w:b/>
-          <w:bCs/>
-          <w:lang w:val="zh-CN"/>
-        </w:rPr>
-      </w:pPr>
-    </w:p>
-    <w:p>
-      <w:pPr>
-        <w:rPr>
+          <w:rFonts w:hint="eastAsia"/>
           <w:b/>
           <w:bCs/>
           <w:lang w:val="zh-CN"/>
@@ -5589,7 +5758,31 @@
               <w:rPr>
                 <w:rFonts w:hint="eastAsia"/>
               </w:rPr>
-              <w:t>4.1.6.</w:t>
+              <w:t>4.</w:t>
+            </w:r>
+            <w:r>
+              <w:rPr>
+                <w:rFonts w:hint="eastAsia"/>
+              </w:rPr>
+              <w:t>3</w:t>
+            </w:r>
+            <w:r>
+              <w:rPr>
+                <w:rFonts w:hint="eastAsia"/>
+              </w:rPr>
+              <w:t>.</w:t>
+            </w:r>
+            <w:r>
+              <w:rPr>
+                <w:rFonts w:hint="eastAsia"/>
+              </w:rPr>
+              <w:t>3</w:t>
+            </w:r>
+            <w:r>
+              <w:rPr>
+                <w:rFonts w:hint="eastAsia"/>
+              </w:rPr>
+              <w:t>.</w:t>
             </w:r>
             <w:r>
               <w:t>1001</w:t>
@@ -5661,6 +5854,9 @@
           <w:p>
             <w:pPr>
               <w:pStyle w:val="af"/>
+              <w:rPr>
+                <w:rFonts w:hint="eastAsia"/>
+              </w:rPr>
             </w:pPr>
             <w:r>
               <w:t>20</w:t>
@@ -5687,7 +5883,7 @@
               <w:rPr>
                 <w:rFonts w:hint="eastAsia"/>
               </w:rPr>
-              <w:t>04</w:t>
+              <w:t>30</w:t>
             </w:r>
           </w:p>
         </w:tc>
@@ -5780,7 +5976,7 @@
           <w:szCs w:val="44"/>
         </w:rPr>
       </w:pPr>
-      <w:bookmarkStart w:id="2" w:name="_Toc231485056"/>
+      <w:bookmarkStart w:id="2" w:name="_Toc233732720"/>
       <w:r>
         <w:rPr>
           <w:kern w:val="44"/>
@@ -5796,7 +5992,7 @@
       <w:pPr>
         <w:pStyle w:val="2"/>
       </w:pPr>
-      <w:bookmarkStart w:id="3" w:name="_Toc231485057"/>
+      <w:bookmarkStart w:id="3" w:name="_Toc233732721"/>
       <w:r>
         <w:t>Target Audience</w:t>
       </w:r>
@@ -5820,7 +6016,7 @@
       <w:pPr>
         <w:pStyle w:val="2"/>
       </w:pPr>
-      <w:bookmarkStart w:id="4" w:name="_Toc231485058"/>
+      <w:bookmarkStart w:id="4" w:name="_Toc233732722"/>
       <w:r>
         <w:t>Overview</w:t>
       </w:r>
@@ -5841,7 +6037,7 @@
       <w:pPr>
         <w:pStyle w:val="2"/>
       </w:pPr>
-      <w:bookmarkStart w:id="5" w:name="_Toc231485059"/>
+      <w:bookmarkStart w:id="5" w:name="_Toc233732723"/>
       <w:r>
         <w:rPr>
           <w:rFonts w:hint="eastAsia"/>
@@ -6574,7 +6770,7 @@
       <w:pPr>
         <w:pStyle w:val="2"/>
       </w:pPr>
-      <w:bookmarkStart w:id="6" w:name="_Toc231485060"/>
+      <w:bookmarkStart w:id="6" w:name="_Toc233732724"/>
       <w:r>
         <w:t>Limitations</w:t>
       </w:r>
@@ -6659,7 +6855,7 @@
       <w:pPr>
         <w:pStyle w:val="2"/>
       </w:pPr>
-      <w:bookmarkStart w:id="7" w:name="_Toc231485061"/>
+      <w:bookmarkStart w:id="7" w:name="_Toc233732725"/>
       <w:r>
         <w:t>Main Features</w:t>
       </w:r>
@@ -6779,11 +6975,8 @@
     <w:p>
       <w:pPr>
         <w:pStyle w:val="1"/>
-        <w:rPr>
-          <w:rFonts w:hint="eastAsia"/>
-        </w:rPr>
-      </w:pPr>
-      <w:bookmarkStart w:id="8" w:name="_Toc231485062"/>
+      </w:pPr>
+      <w:bookmarkStart w:id="8" w:name="_Toc233732726"/>
       <w:proofErr w:type="gramStart"/>
       <w:r>
         <w:rPr>
@@ -6810,11 +7003,8 @@
     <w:p>
       <w:pPr>
         <w:pStyle w:val="2"/>
-        <w:rPr>
-          <w:rFonts w:hint="eastAsia"/>
-        </w:rPr>
-      </w:pPr>
-      <w:bookmarkStart w:id="9" w:name="_Toc231485063"/>
+      </w:pPr>
+      <w:bookmarkStart w:id="9" w:name="_Toc233732727"/>
       <w:r>
         <w:rPr>
           <w:rFonts w:hint="eastAsia"/>
@@ -6832,11 +7022,8 @@
     <w:p>
       <w:pPr>
         <w:pStyle w:val="3"/>
-        <w:rPr>
-          <w:rFonts w:hint="eastAsia"/>
-        </w:rPr>
-      </w:pPr>
-      <w:bookmarkStart w:id="10" w:name="_Toc231485064"/>
+      </w:pPr>
+      <w:bookmarkStart w:id="10" w:name="_Toc233732728"/>
       <w:r>
         <w:rPr>
           <w:rFonts w:hint="eastAsia"/>
@@ -6857,13 +7044,7 @@
         <w:rPr>
           <w:rFonts w:hint="eastAsia"/>
         </w:rPr>
-        <w:t>API:</w:t>
-      </w:r>
-      <w:r>
-        <w:rPr>
-          <w:rFonts w:hint="eastAsia"/>
-        </w:rPr>
-        <w:t>HTTP</w:t>
+        <w:t>API:HTTP</w:t>
       </w:r>
       <w:proofErr w:type="gramEnd"/>
     </w:p>
@@ -6892,13 +7073,7 @@
         <w:rPr>
           <w:rFonts w:hint="eastAsia"/>
         </w:rPr>
-        <w:t>Address:</w:t>
-      </w:r>
-      <w:r>
-        <w:rPr>
-          <w:rFonts w:hint="eastAsia"/>
-        </w:rPr>
-        <w:t>http</w:t>
+        <w:t>Address:http</w:t>
       </w:r>
       <w:proofErr w:type="spellEnd"/>
       <w:r>
@@ -7013,10 +7188,7 @@
       </w:r>
       <w:proofErr w:type="spellEnd"/>
       <w:r>
-        <w:t xml:space="preserve"> is limited to UDP, and you can specify the output on a specific network interface.</w:t>
-      </w:r>
-      <w:r>
-        <w:t xml:space="preserve"> </w:t>
+        <w:t xml:space="preserve"> is limited to UDP, and you can specify the output on a specific network interface. </w:t>
       </w:r>
     </w:p>
     <w:p/>
@@ -7318,11 +7490,6 @@
       </w:r>
     </w:p>
     <w:p>
-      <w:pPr>
-        <w:rPr>
-          <w:rFonts w:hint="eastAsia"/>
-        </w:rPr>
-      </w:pPr>
       <w:r>
         <w:rPr>
           <w:rFonts w:hint="eastAsia"/>
@@ -7404,7 +7571,7 @@
       <w:pPr>
         <w:pStyle w:val="3"/>
       </w:pPr>
-      <w:bookmarkStart w:id="11" w:name="_Toc231485065"/>
+      <w:bookmarkStart w:id="11" w:name="_Toc233732729"/>
       <w:r>
         <w:rPr>
           <w:rFonts w:hint="eastAsia"/>
@@ -7467,11 +7634,8 @@
     <w:p>
       <w:pPr>
         <w:pStyle w:val="2"/>
-        <w:rPr>
-          <w:rFonts w:hint="eastAsia"/>
-        </w:rPr>
-      </w:pPr>
-      <w:bookmarkStart w:id="12" w:name="_Toc231485066"/>
+      </w:pPr>
+      <w:bookmarkStart w:id="12" w:name="_Toc233732730"/>
       <w:r>
         <w:rPr>
           <w:rFonts w:hint="eastAsia"/>
@@ -7490,7 +7654,7 @@
       <w:pPr>
         <w:pStyle w:val="3"/>
       </w:pPr>
-      <w:bookmarkStart w:id="13" w:name="_Toc231485067"/>
+      <w:bookmarkStart w:id="13" w:name="_Toc233732731"/>
       <w:r>
         <w:rPr>
           <w:rFonts w:hint="eastAsia"/>
@@ -7511,13 +7675,7 @@
         <w:rPr>
           <w:rFonts w:hint="eastAsia"/>
         </w:rPr>
-        <w:t>API:</w:t>
-      </w:r>
-      <w:r>
-        <w:rPr>
-          <w:rFonts w:hint="eastAsia"/>
-        </w:rPr>
-        <w:t>HTTP</w:t>
+        <w:t>API:HTTP</w:t>
       </w:r>
       <w:proofErr w:type="gramEnd"/>
     </w:p>
@@ -7546,13 +7704,7 @@
         <w:rPr>
           <w:rFonts w:hint="eastAsia"/>
         </w:rPr>
-        <w:t>Address:</w:t>
-      </w:r>
-      <w:r>
-        <w:rPr>
-          <w:rFonts w:hint="eastAsia"/>
-        </w:rPr>
-        <w:t>http</w:t>
+        <w:t>Address:http</w:t>
       </w:r>
       <w:proofErr w:type="spellEnd"/>
       <w:r>
@@ -7611,11 +7763,8 @@
     <w:p>
       <w:pPr>
         <w:pStyle w:val="3"/>
-        <w:rPr>
-          <w:rFonts w:hint="eastAsia"/>
-        </w:rPr>
-      </w:pPr>
-      <w:bookmarkStart w:id="14" w:name="_Toc231485068"/>
+      </w:pPr>
+      <w:bookmarkStart w:id="14" w:name="_Toc233732732"/>
       <w:r>
         <w:rPr>
           <w:rFonts w:hint="eastAsia"/>
@@ -7669,11 +7818,8 @@
     <w:p>
       <w:pPr>
         <w:pStyle w:val="2"/>
-        <w:rPr>
-          <w:rFonts w:hint="eastAsia"/>
-        </w:rPr>
-      </w:pPr>
-      <w:bookmarkStart w:id="15" w:name="_Toc231485069"/>
+      </w:pPr>
+      <w:bookmarkStart w:id="15" w:name="_Toc233732733"/>
       <w:r>
         <w:rPr>
           <w:rFonts w:hint="eastAsia"/>
@@ -7703,7 +7849,7 @@
       <w:pPr>
         <w:pStyle w:val="3"/>
       </w:pPr>
-      <w:bookmarkStart w:id="16" w:name="_Toc231485070"/>
+      <w:bookmarkStart w:id="16" w:name="_Toc233732734"/>
       <w:r>
         <w:rPr>
           <w:rFonts w:hint="eastAsia"/>
@@ -7724,13 +7870,7 @@
         <w:rPr>
           <w:rFonts w:hint="eastAsia"/>
         </w:rPr>
-        <w:t>API:</w:t>
-      </w:r>
-      <w:r>
-        <w:rPr>
-          <w:rFonts w:hint="eastAsia"/>
-        </w:rPr>
-        <w:t>HTTP</w:t>
+        <w:t>API:HTTP</w:t>
       </w:r>
       <w:proofErr w:type="gramEnd"/>
     </w:p>
@@ -7759,13 +7899,7 @@
         <w:rPr>
           <w:rFonts w:hint="eastAsia"/>
         </w:rPr>
-        <w:t>Address:</w:t>
-      </w:r>
-      <w:r>
-        <w:rPr>
-          <w:rFonts w:hint="eastAsia"/>
-        </w:rPr>
-        <w:t>http</w:t>
+        <w:t>Address:http</w:t>
       </w:r>
       <w:proofErr w:type="spellEnd"/>
       <w:r>
@@ -7927,10 +8061,7 @@
         <w:t>:</w:t>
       </w:r>
       <w:r>
-        <w:t xml:space="preserve"> </w:t>
-      </w:r>
-      <w:r>
-        <w:t>This is the system playback time. It is divided into three playback modes.</w:t>
+        <w:t xml:space="preserve"> This is the system playback time. It is divided into three playback modes.</w:t>
       </w:r>
     </w:p>
     <w:p>
@@ -8074,9 +8205,6 @@
     <w:p>
       <w:pPr>
         <w:ind w:left="440"/>
-        <w:rPr>
-          <w:rFonts w:hint="eastAsia"/>
-        </w:rPr>
       </w:pPr>
       <w:proofErr w:type="spellStart"/>
       <w:r>
@@ -8118,9 +8246,6 @@
     <w:p>
       <w:pPr>
         <w:pStyle w:val="a"/>
-        <w:rPr>
-          <w:rFonts w:hint="eastAsia"/>
-        </w:rPr>
       </w:pPr>
       <w:proofErr w:type="spellStart"/>
       <w:r>
@@ -8184,7 +8309,7 @@
       <w:pPr>
         <w:pStyle w:val="3"/>
       </w:pPr>
-      <w:bookmarkStart w:id="17" w:name="_Toc231485071"/>
+      <w:bookmarkStart w:id="17" w:name="_Toc233732735"/>
       <w:r>
         <w:rPr>
           <w:rFonts w:hint="eastAsia"/>
@@ -8230,11 +8355,8 @@
     <w:p>
       <w:pPr>
         <w:pStyle w:val="2"/>
-        <w:rPr>
-          <w:rFonts w:hint="eastAsia"/>
-        </w:rPr>
-      </w:pPr>
-      <w:bookmarkStart w:id="18" w:name="_Toc231485072"/>
+      </w:pPr>
+      <w:bookmarkStart w:id="18" w:name="_Toc233732736"/>
       <w:r>
         <w:rPr>
           <w:rFonts w:hint="eastAsia"/>
@@ -8256,7 +8378,7 @@
       <w:pPr>
         <w:pStyle w:val="3"/>
       </w:pPr>
-      <w:bookmarkStart w:id="19" w:name="_Toc231485073"/>
+      <w:bookmarkStart w:id="19" w:name="_Toc233732737"/>
       <w:r>
         <w:rPr>
           <w:rFonts w:hint="eastAsia"/>
@@ -8365,7 +8487,7 @@
       <w:pPr>
         <w:pStyle w:val="3"/>
       </w:pPr>
-      <w:bookmarkStart w:id="20" w:name="_Toc231485074"/>
+      <w:bookmarkStart w:id="20" w:name="_Toc233732738"/>
       <w:r>
         <w:rPr>
           <w:rFonts w:hint="eastAsia"/>
@@ -8381,11 +8503,6 @@
       <w:bookmarkEnd w:id="20"/>
     </w:p>
     <w:p>
-      <w:pPr>
-        <w:rPr>
-          <w:rFonts w:hint="eastAsia"/>
-        </w:rPr>
-      </w:pPr>
       <w:r>
         <w:rPr>
           <w:rFonts w:hint="eastAsia"/>
@@ -8495,11 +8612,8 @@
     <w:p>
       <w:pPr>
         <w:pStyle w:val="2"/>
-        <w:rPr>
-          <w:rFonts w:hint="eastAsia"/>
-        </w:rPr>
-      </w:pPr>
-      <w:bookmarkStart w:id="21" w:name="_Toc231485075"/>
+      </w:pPr>
+      <w:bookmarkStart w:id="21" w:name="_Toc233732739"/>
       <w:r>
         <w:rPr>
           <w:rFonts w:hint="eastAsia"/>
@@ -8518,7 +8632,7 @@
       <w:pPr>
         <w:pStyle w:val="3"/>
       </w:pPr>
-      <w:bookmarkStart w:id="22" w:name="_Toc231485076"/>
+      <w:bookmarkStart w:id="22" w:name="_Toc233732740"/>
       <w:r>
         <w:rPr>
           <w:rFonts w:hint="eastAsia"/>
@@ -8668,7 +8782,7 @@
       <w:pPr>
         <w:pStyle w:val="3"/>
       </w:pPr>
-      <w:bookmarkStart w:id="23" w:name="_Toc231485077"/>
+      <w:bookmarkStart w:id="23" w:name="_Toc233732741"/>
       <w:r>
         <w:rPr>
           <w:rFonts w:hint="eastAsia"/>
@@ -8700,13 +8814,7 @@
         <w:t>Time: Total file duration, unit is seconds, double, floating-point type</w:t>
       </w:r>
     </w:p>
-    <w:p>
-      <w:pPr>
-        <w:rPr>
-          <w:rFonts w:hint="eastAsia"/>
-        </w:rPr>
-      </w:pPr>
-    </w:p>
+    <w:p/>
     <w:p>
       <w:r>
         <w:t>{</w:t>
@@ -8777,11 +8885,8 @@
     <w:p>
       <w:pPr>
         <w:pStyle w:val="2"/>
-        <w:rPr>
-          <w:rFonts w:hint="eastAsia"/>
-        </w:rPr>
-      </w:pPr>
-      <w:bookmarkStart w:id="24" w:name="_Toc231485078"/>
+      </w:pPr>
+      <w:bookmarkStart w:id="24" w:name="_Toc233732742"/>
       <w:r>
         <w:rPr>
           <w:rFonts w:hint="eastAsia"/>
@@ -8800,7 +8905,7 @@
       <w:pPr>
         <w:pStyle w:val="3"/>
       </w:pPr>
-      <w:bookmarkStart w:id="25" w:name="_Toc231485079"/>
+      <w:bookmarkStart w:id="25" w:name="_Toc233732743"/>
       <w:r>
         <w:rPr>
           <w:rFonts w:hint="eastAsia"/>
@@ -8979,10 +9084,7 @@
         <w:t>:</w:t>
       </w:r>
       <w:r>
-        <w:t xml:space="preserve"> </w:t>
-      </w:r>
-      <w:r>
-        <w:t>Communication protocol version, currently 1</w:t>
+        <w:t xml:space="preserve"> Communication protocol version, currently 1</w:t>
       </w:r>
     </w:p>
     <w:p>
@@ -9060,10 +9162,7 @@
         <w:t>:</w:t>
       </w:r>
       <w:r>
-        <w:t xml:space="preserve"> </w:t>
-      </w:r>
-      <w:r>
-        <w:t xml:space="preserve">Audio encoding parameter configuration: </w:t>
+        <w:t xml:space="preserve"> Audio encoding parameter configuration: </w:t>
       </w:r>
       <w:proofErr w:type="spellStart"/>
       <w:r>
@@ -9899,9 +9998,6 @@
     <w:p>
       <w:pPr>
         <w:pStyle w:val="a"/>
-        <w:rPr>
-          <w:rFonts w:hint="eastAsia"/>
-        </w:rPr>
       </w:pPr>
       <w:proofErr w:type="spellStart"/>
       <w:r>
@@ -10004,10 +10100,7 @@
         <w:t>:</w:t>
       </w:r>
       <w:r>
-        <w:t xml:space="preserve"> </w:t>
-      </w:r>
-      <w:r>
-        <w:t>Need corresponding encoders, AAC is 8, MP2 is 1</w:t>
+        <w:t xml:space="preserve"> Need corresponding encoders, AAC is 8, MP2 is 1</w:t>
       </w:r>
     </w:p>
     <w:p>
@@ -10021,9 +10114,6 @@
     <w:p>
       <w:pPr>
         <w:pStyle w:val="a"/>
-        <w:rPr>
-          <w:rFonts w:hint="eastAsia"/>
-        </w:rPr>
       </w:pPr>
       <w:r>
         <w:t>Buffer size: half of the average bitrate</w:t>
@@ -10819,7 +10909,7 @@
       <w:pPr>
         <w:pStyle w:val="3"/>
       </w:pPr>
-      <w:bookmarkStart w:id="26" w:name="_Toc231485080"/>
+      <w:bookmarkStart w:id="26" w:name="_Toc233732744"/>
       <w:r>
         <w:rPr>
           <w:rFonts w:hint="eastAsia"/>
@@ -10875,11 +10965,8 @@
     <w:p>
       <w:pPr>
         <w:pStyle w:val="2"/>
-        <w:rPr>
-          <w:rFonts w:hint="eastAsia"/>
-        </w:rPr>
-      </w:pPr>
-      <w:bookmarkStart w:id="27" w:name="_Toc231485081"/>
+      </w:pPr>
+      <w:bookmarkStart w:id="27" w:name="_Toc233732745"/>
       <w:r>
         <w:rPr>
           <w:rFonts w:hint="eastAsia"/>
@@ -10898,7 +10985,7 @@
       <w:pPr>
         <w:pStyle w:val="3"/>
       </w:pPr>
-      <w:bookmarkStart w:id="28" w:name="_Toc231485082"/>
+      <w:bookmarkStart w:id="28" w:name="_Toc233732746"/>
       <w:r>
         <w:rPr>
           <w:rFonts w:hint="eastAsia"/>
@@ -11017,11 +11104,6 @@
       </w:r>
     </w:p>
     <w:p>
-      <w:pPr>
-        <w:rPr>
-          <w:rFonts w:hint="eastAsia"/>
-        </w:rPr>
-      </w:pPr>
       <w:r>
         <w:rPr>
           <w:rFonts w:hint="eastAsia"/>
@@ -11045,7 +11127,7 @@
       <w:pPr>
         <w:pStyle w:val="3"/>
       </w:pPr>
-      <w:bookmarkStart w:id="29" w:name="_Toc231485083"/>
+      <w:bookmarkStart w:id="29" w:name="_Toc233732747"/>
       <w:r>
         <w:rPr>
           <w:rFonts w:hint="eastAsia"/>
@@ -11307,9 +11389,6 @@
     <w:p>
       <w:pPr>
         <w:pStyle w:val="a"/>
-        <w:rPr>
-          <w:rFonts w:hint="eastAsia"/>
-        </w:rPr>
       </w:pPr>
       <w:r>
         <w:t>nStatus:0, idle, 1 is streaming, -1 is a serious error, need to close this handle and reopen it</w:t>
@@ -11319,7 +11398,7 @@
       <w:pPr>
         <w:pStyle w:val="2"/>
       </w:pPr>
-      <w:bookmarkStart w:id="30" w:name="_Toc231485084"/>
+      <w:bookmarkStart w:id="30" w:name="_Toc233732748"/>
       <w:r>
         <w:rPr>
           <w:rFonts w:hint="eastAsia"/>
@@ -11364,7 +11443,6 @@
       <w:pPr>
         <w:ind w:firstLineChars="200" w:firstLine="420"/>
         <w:rPr>
-          <w:rFonts w:hint="eastAsia"/>
           <w:color w:val="EE0000"/>
         </w:rPr>
       </w:pPr>
@@ -11378,11 +11456,8 @@
     <w:p>
       <w:pPr>
         <w:pStyle w:val="3"/>
-        <w:rPr>
-          <w:rFonts w:hint="eastAsia"/>
-        </w:rPr>
-      </w:pPr>
-      <w:bookmarkStart w:id="31" w:name="_Toc231485085"/>
+      </w:pPr>
+      <w:bookmarkStart w:id="31" w:name="_Toc233732749"/>
       <w:r>
         <w:rPr>
           <w:rFonts w:hint="eastAsia"/>
@@ -11503,11 +11578,6 @@
       </w:r>
     </w:p>
     <w:p>
-      <w:pPr>
-        <w:rPr>
-          <w:rFonts w:hint="eastAsia"/>
-        </w:rPr>
-      </w:pPr>
       <w:r>
         <w:rPr>
           <w:rFonts w:hint="eastAsia"/>
@@ -11610,11 +11680,8 @@
     <w:p>
       <w:pPr>
         <w:pStyle w:val="3"/>
-        <w:rPr>
-          <w:rFonts w:hint="eastAsia"/>
-        </w:rPr>
-      </w:pPr>
-      <w:bookmarkStart w:id="32" w:name="_Toc231485086"/>
+      </w:pPr>
+      <w:bookmarkStart w:id="32" w:name="_Toc233732750"/>
       <w:r>
         <w:rPr>
           <w:rFonts w:hint="eastAsia"/>
@@ -11764,11 +11831,7 @@
       </w:r>
     </w:p>
     <w:p>
-      <w:pPr>
-        <w:rPr>
-          <w:rFonts w:hint="eastAsia"/>
-        </w:rPr>
-      </w:pPr>
+      <w:proofErr w:type="spellStart"/>
       <w:proofErr w:type="gramStart"/>
       <w:r>
         <w:rPr>
@@ -11782,6 +11845,7 @@
         </w:rPr>
         <w:t>NULL</w:t>
       </w:r>
+      <w:proofErr w:type="spellEnd"/>
       <w:proofErr w:type="gramEnd"/>
     </w:p>
     <w:p>
@@ -11854,11 +11918,8 @@
     <w:p>
       <w:pPr>
         <w:pStyle w:val="3"/>
-        <w:rPr>
-          <w:rFonts w:hint="eastAsia"/>
-        </w:rPr>
-      </w:pPr>
-      <w:bookmarkStart w:id="33" w:name="_Toc231485087"/>
+      </w:pPr>
+      <w:bookmarkStart w:id="33" w:name="_Toc233732751"/>
       <w:r>
         <w:rPr>
           <w:rFonts w:hint="eastAsia"/>
@@ -12449,10 +12510,7 @@
         <w:t>:</w:t>
       </w:r>
       <w:r>
-        <w:t xml:space="preserve"> </w:t>
-      </w:r>
-      <w:r>
-        <w:t>Proportional scaling, floating-point type, 1.0: normal size, 0.5: half size, 1.5: 1.5 times magnification</w:t>
+        <w:t xml:space="preserve"> Proportional scaling, floating-point type, 1.0: normal size, 0.5: half size, 1.5: 1.5 times magnification</w:t>
       </w:r>
     </w:p>
     <w:p>
@@ -12471,10 +12529,7 @@
         <w:t>:</w:t>
       </w:r>
       <w:r>
-        <w:t xml:space="preserve"> </w:t>
-      </w:r>
-      <w:r>
-        <w:t>Enable internal timer, set display time, unit: seconds (not supported)</w:t>
+        <w:t xml:space="preserve"> Enable internal timer, set display time, unit: seconds (not supported)</w:t>
       </w:r>
     </w:p>
     <w:p>
@@ -12511,10 +12566,7 @@
         <w:t>:</w:t>
       </w:r>
       <w:r>
-        <w:t xml:space="preserve"> </w:t>
-      </w:r>
-      <w:r>
-        <w:t>Position, 0, 0 indicates the top-left corner of the video</w:t>
+        <w:t xml:space="preserve"> Position, 0, 0 indicates the top-left corner of the video</w:t>
       </w:r>
     </w:p>
     <w:p>
@@ -12536,10 +12588,7 @@
         <w:t>:</w:t>
       </w:r>
       <w:r>
-        <w:t xml:space="preserve"> </w:t>
-      </w:r>
-      <w:r>
-        <w:t>image file address</w:t>
+        <w:t xml:space="preserve"> image file address</w:t>
       </w:r>
     </w:p>
     <w:p>
@@ -12561,18 +12610,12 @@
         <w:t>:</w:t>
       </w:r>
       <w:r>
-        <w:t xml:space="preserve"> </w:t>
-      </w:r>
-      <w:r>
-        <w:t>font size</w:t>
+        <w:t xml:space="preserve"> font size</w:t>
       </w:r>
     </w:p>
     <w:p>
       <w:pPr>
         <w:pStyle w:val="a"/>
-        <w:rPr>
-          <w:rFonts w:hint="eastAsia"/>
-        </w:rPr>
       </w:pPr>
       <w:proofErr w:type="spellStart"/>
       <w:r>
@@ -12628,10 +12671,51 @@
         <w:t>:</w:t>
       </w:r>
       <w:r>
+        <w:t xml:space="preserve"> Text to display</w:t>
+      </w:r>
+    </w:p>
+    <w:p>
+      <w:pPr>
+        <w:pStyle w:val="a"/>
+      </w:pPr>
+      <w:proofErr w:type="spellStart"/>
+      <w:r>
+        <w:t>nAlpha</w:t>
+      </w:r>
+      <w:proofErr w:type="spellEnd"/>
+      <w:r>
+        <w:rPr>
+          <w:rFonts w:hint="eastAsia"/>
+        </w:rPr>
+        <w:t>:</w:t>
+      </w:r>
+      <w:r>
+        <w:t xml:space="preserve"> Default value is 100; the range is 1-100, representing values from transparent to opaque</w:t>
+      </w:r>
+    </w:p>
+    <w:p>
+      <w:pPr>
+        <w:pStyle w:val="a"/>
+      </w:pPr>
+      <w:proofErr w:type="spellStart"/>
+      <w:r>
+        <w:rPr>
+          <w:rFonts w:hint="eastAsia"/>
+        </w:rPr>
+        <w:t>nBorder</w:t>
+      </w:r>
+      <w:proofErr w:type="spellEnd"/>
+      <w:r>
+        <w:rPr>
+          <w:rFonts w:hint="eastAsia"/>
+        </w:rPr>
+        <w:t>:</w:t>
+      </w:r>
+      <w:r>
         <w:t xml:space="preserve"> </w:t>
       </w:r>
       <w:r>
-        <w:t>Text to display</w:t>
+        <w:t>Contour lines: -1 means disabled, &gt;=0 means enabled and indicates line width</w:t>
       </w:r>
     </w:p>
     <w:p>
@@ -12640,7 +12724,10 @@
       </w:pPr>
       <w:proofErr w:type="spellStart"/>
       <w:r>
-        <w:t>nAlpha</w:t>
+        <w:rPr>
+          <w:color w:val="EE0000"/>
+        </w:rPr>
+        <w:t>tszColor</w:t>
       </w:r>
       <w:proofErr w:type="spellEnd"/>
       <w:r>
@@ -12650,10 +12737,7 @@
         <w:t>:</w:t>
       </w:r>
       <w:r>
-        <w:t xml:space="preserve"> </w:t>
-      </w:r>
-      <w:r>
-        <w:t>Default value is 100; the range is 1-100, representing values from transparent to opaque</w:t>
+        <w:t xml:space="preserve"> B-G-R color format, for example, red is 0-0-255, with decimal values ranging from 0 to 255</w:t>
       </w:r>
     </w:p>
     <w:p>
@@ -12662,10 +12746,7 @@
       </w:pPr>
       <w:proofErr w:type="spellStart"/>
       <w:r>
-        <w:rPr>
-          <w:rFonts w:hint="eastAsia"/>
-        </w:rPr>
-        <w:t>nBorder</w:t>
+        <w:t>nSpeed</w:t>
       </w:r>
       <w:proofErr w:type="spellEnd"/>
       <w:r>
@@ -12675,57 +12756,7 @@
         <w:t>:</w:t>
       </w:r>
       <w:r>
-        <w:t xml:space="preserve"> </w:t>
-      </w:r>
-      <w:r>
-        <w:t>contour lines</w:t>
-      </w:r>
-    </w:p>
-    <w:p>
-      <w:pPr>
-        <w:pStyle w:val="a"/>
-      </w:pPr>
-      <w:proofErr w:type="spellStart"/>
-      <w:r>
-        <w:rPr>
-          <w:color w:val="EE0000"/>
-        </w:rPr>
-        <w:t>tszColor</w:t>
-      </w:r>
-      <w:proofErr w:type="spellEnd"/>
-      <w:r>
-        <w:rPr>
-          <w:rFonts w:hint="eastAsia"/>
-        </w:rPr>
-        <w:t>:</w:t>
-      </w:r>
-      <w:r>
-        <w:t xml:space="preserve"> </w:t>
-      </w:r>
-      <w:r>
-        <w:t>B-G-R color format, for example, red is 0-0-255, with decimal values ranging from 0 to 255</w:t>
-      </w:r>
-    </w:p>
-    <w:p>
-      <w:pPr>
-        <w:pStyle w:val="a"/>
-      </w:pPr>
-      <w:proofErr w:type="spellStart"/>
-      <w:r>
-        <w:t>nSpeed</w:t>
-      </w:r>
-      <w:proofErr w:type="spellEnd"/>
-      <w:r>
-        <w:rPr>
-          <w:rFonts w:hint="eastAsia"/>
-        </w:rPr>
-        <w:t>:</w:t>
-      </w:r>
-      <w:r>
-        <w:t xml:space="preserve"> </w:t>
-      </w:r>
-      <w:r>
-        <w:t xml:space="preserve">Greater than 0 indicates the marquee effect; otherwise, it does not move. </w:t>
+        <w:t xml:space="preserve"> Greater than 0 indicates the marquee effect; otherwise, it does not move. </w:t>
       </w:r>
       <w:proofErr w:type="spellStart"/>
       <w:r>
@@ -12835,11 +12866,8 @@
     <w:p>
       <w:pPr>
         <w:pStyle w:val="3"/>
-        <w:rPr>
-          <w:rFonts w:hint="eastAsia"/>
-        </w:rPr>
-      </w:pPr>
-      <w:bookmarkStart w:id="34" w:name="_Toc231485088"/>
+      </w:pPr>
+      <w:bookmarkStart w:id="34" w:name="_Toc233732752"/>
       <w:r>
         <w:rPr>
           <w:rFonts w:hint="eastAsia"/>
@@ -12963,11 +12991,7 @@
       </w:r>
     </w:p>
     <w:p>
-      <w:pPr>
-        <w:rPr>
-          <w:rFonts w:hint="eastAsia"/>
-        </w:rPr>
-      </w:pPr>
+      <w:proofErr w:type="spellStart"/>
       <w:proofErr w:type="gramStart"/>
       <w:r>
         <w:rPr>
@@ -12981,6 +13005,7 @@
         </w:rPr>
         <w:t>NULL</w:t>
       </w:r>
+      <w:proofErr w:type="spellEnd"/>
       <w:proofErr w:type="gramEnd"/>
     </w:p>
     <w:p>
@@ -13042,7 +13067,7 @@
       <w:pPr>
         <w:pStyle w:val="3"/>
       </w:pPr>
-      <w:bookmarkStart w:id="35" w:name="_Toc231485089"/>
+      <w:bookmarkStart w:id="35" w:name="_Toc233732753"/>
       <w:r>
         <w:rPr>
           <w:rFonts w:hint="eastAsia"/>
@@ -13342,7 +13367,7 @@
       <w:pPr>
         <w:pStyle w:val="2"/>
       </w:pPr>
-      <w:bookmarkStart w:id="36" w:name="_Toc231485090"/>
+      <w:bookmarkStart w:id="36" w:name="_Toc233732754"/>
       <w:r>
         <w:rPr>
           <w:rFonts w:hint="eastAsia"/>
@@ -13354,11 +13379,8 @@
     <w:p>
       <w:pPr>
         <w:pStyle w:val="3"/>
-        <w:rPr>
-          <w:rFonts w:hint="eastAsia"/>
-        </w:rPr>
-      </w:pPr>
-      <w:bookmarkStart w:id="37" w:name="_Toc231485091"/>
+      </w:pPr>
+      <w:bookmarkStart w:id="37" w:name="_Toc233732755"/>
       <w:r>
         <w:rPr>
           <w:rFonts w:hint="eastAsia"/>
@@ -13661,11 +13683,8 @@
     <w:p>
       <w:pPr>
         <w:pStyle w:val="3"/>
-        <w:rPr>
-          <w:rFonts w:hint="eastAsia"/>
-        </w:rPr>
-      </w:pPr>
-      <w:bookmarkStart w:id="38" w:name="_Toc231485092"/>
+      </w:pPr>
+      <w:bookmarkStart w:id="38" w:name="_Toc233732756"/>
       <w:r>
         <w:rPr>
           <w:rFonts w:hint="eastAsia"/>
@@ -14083,18 +14102,12 @@
         <w:t>:</w:t>
       </w:r>
       <w:r>
-        <w:t xml:space="preserve"> </w:t>
-      </w:r>
-      <w:r>
-        <w:t>Still frame detection, used to detect whether the input frame has still frame stuttering</w:t>
+        <w:t xml:space="preserve"> Still frame detection, used to detect whether the input frame has still frame stuttering</w:t>
       </w:r>
     </w:p>
     <w:p>
       <w:pPr>
         <w:pStyle w:val="a"/>
-        <w:rPr>
-          <w:rFonts w:hint="eastAsia"/>
-        </w:rPr>
       </w:pPr>
       <w:proofErr w:type="spellStart"/>
       <w:r>
@@ -14137,10 +14150,7 @@
         <w:t>:</w:t>
       </w:r>
       <w:r>
-        <w:t xml:space="preserve"> </w:t>
-      </w:r>
-      <w:r>
-        <w:t>Threshold: the smaller, the more sensitive</w:t>
+        <w:t xml:space="preserve"> Threshold: the smaller, the more sensitive</w:t>
       </w:r>
     </w:p>
     <w:p>
@@ -14159,10 +14169,7 @@
         <w:t>:</w:t>
       </w:r>
       <w:r>
-        <w:t xml:space="preserve"> </w:t>
-      </w:r>
-      <w:r>
-        <w:t>detect the minimum time</w:t>
+        <w:t xml:space="preserve"> detect the minimum time</w:t>
       </w:r>
     </w:p>
     <w:p>
@@ -14181,10 +14188,7 @@
         <w:t>:</w:t>
       </w:r>
       <w:r>
-        <w:t xml:space="preserve"> </w:t>
-      </w:r>
-      <w:r>
-        <w:t>minimum detection frame</w:t>
+        <w:t xml:space="preserve"> minimum detection frame</w:t>
       </w:r>
     </w:p>
     <w:p>
@@ -14203,10 +14207,7 @@
         <w:t>:</w:t>
       </w:r>
       <w:r>
-        <w:t xml:space="preserve"> </w:t>
-      </w:r>
-      <w:r>
-        <w:t>Black screen detection, which can detect when the screen goes black</w:t>
+        <w:t xml:space="preserve"> Black screen detection, which can detect when the screen goes black</w:t>
       </w:r>
     </w:p>
     <w:p>
@@ -14225,10 +14226,7 @@
         <w:t>:</w:t>
       </w:r>
       <w:r>
-        <w:t xml:space="preserve"> </w:t>
-      </w:r>
-      <w:r>
-        <w:t>audio silence detection</w:t>
+        <w:t xml:space="preserve"> audio silence detection</w:t>
       </w:r>
     </w:p>
     <w:p>
@@ -14251,11 +14249,8 @@
     <w:p>
       <w:pPr>
         <w:pStyle w:val="2"/>
-        <w:rPr>
-          <w:rFonts w:hint="eastAsia"/>
-        </w:rPr>
-      </w:pPr>
-      <w:bookmarkStart w:id="39" w:name="_Toc231485093"/>
+      </w:pPr>
+      <w:bookmarkStart w:id="39" w:name="_Toc233732757"/>
       <w:r>
         <w:rPr>
           <w:rFonts w:hint="eastAsia"/>
@@ -14334,7 +14329,7 @@
       <w:pPr>
         <w:pStyle w:val="3"/>
       </w:pPr>
-      <w:bookmarkStart w:id="40" w:name="_Toc231485094"/>
+      <w:bookmarkStart w:id="40" w:name="_Toc233732758"/>
       <w:r>
         <w:rPr>
           <w:rFonts w:hint="eastAsia"/>
@@ -14604,9 +14599,6 @@
     <w:p>
       <w:pPr>
         <w:pStyle w:val="a"/>
-        <w:rPr>
-          <w:rFonts w:hint="eastAsia"/>
-        </w:rPr>
       </w:pPr>
       <w:proofErr w:type="spellStart"/>
       <w:r>
@@ -14621,7 +14613,7 @@
       <w:pPr>
         <w:pStyle w:val="3"/>
       </w:pPr>
-      <w:bookmarkStart w:id="41" w:name="_Toc231485095"/>
+      <w:bookmarkStart w:id="41" w:name="_Toc233732759"/>
       <w:r>
         <w:rPr>
           <w:rFonts w:hint="eastAsia"/>
@@ -14658,12 +14650,466 @@
     </w:p>
     <w:p>
       <w:pPr>
+        <w:pStyle w:val="2"/>
+      </w:pPr>
+      <w:bookmarkStart w:id="42" w:name="_Toc233375897"/>
+      <w:bookmarkStart w:id="43" w:name="_Toc233732760"/>
+      <w:r>
+        <w:rPr>
+          <w:rFonts w:hint="eastAsia"/>
+        </w:rPr>
+        <w:t>1.11 SCTE-35</w:t>
+      </w:r>
+      <w:bookmarkEnd w:id="42"/>
+      <w:bookmarkEnd w:id="43"/>
+    </w:p>
+    <w:p>
+      <w:r>
+        <w:rPr>
+          <w:rFonts w:hint="eastAsia"/>
+        </w:rPr>
+        <w:t xml:space="preserve">    </w:t>
+      </w:r>
+      <w:r>
+        <w:t>Ad marker is the SCTE-35 standard, used for PID injection into TS streams. The PID is fixed at 0x111.</w:t>
+      </w:r>
+    </w:p>
+    <w:p>
+      <w:pPr>
+        <w:pStyle w:val="3"/>
+      </w:pPr>
+      <w:bookmarkStart w:id="44" w:name="_Toc233375898"/>
+      <w:bookmarkStart w:id="45" w:name="_Toc233732761"/>
+      <w:r>
+        <w:rPr>
+          <w:rFonts w:hint="eastAsia"/>
+        </w:rPr>
+        <w:t xml:space="preserve">1.11.1 </w:t>
+      </w:r>
+      <w:bookmarkEnd w:id="44"/>
+      <w:r>
+        <w:rPr>
+          <w:rFonts w:hint="eastAsia"/>
+        </w:rPr>
+        <w:t>Request</w:t>
+      </w:r>
+      <w:bookmarkEnd w:id="45"/>
+    </w:p>
+    <w:p>
+      <w:proofErr w:type="gramStart"/>
+      <w:r>
+        <w:rPr>
+          <w:rFonts w:hint="eastAsia"/>
+        </w:rPr>
+        <w:t>API</w:t>
+      </w:r>
+      <w:r>
+        <w:rPr>
+          <w:rFonts w:hint="eastAsia"/>
+        </w:rPr>
+        <w:t>:HTTP</w:t>
+      </w:r>
+      <w:proofErr w:type="gramEnd"/>
+    </w:p>
+    <w:p>
+      <w:proofErr w:type="spellStart"/>
+      <w:proofErr w:type="gramStart"/>
+      <w:r>
+        <w:rPr>
+          <w:rFonts w:hint="eastAsia"/>
+        </w:rPr>
+        <w:t>Method</w:t>
+      </w:r>
+      <w:r>
+        <w:rPr>
+          <w:rFonts w:hint="eastAsia"/>
+        </w:rPr>
+        <w:t>:GET</w:t>
+      </w:r>
+      <w:proofErr w:type="spellEnd"/>
+      <w:proofErr w:type="gramEnd"/>
+    </w:p>
+    <w:p>
+      <w:proofErr w:type="gramStart"/>
+      <w:r>
+        <w:rPr>
+          <w:rFonts w:hint="eastAsia"/>
+        </w:rPr>
+        <w:t>Address</w:t>
+      </w:r>
+      <w:r>
+        <w:rPr>
+          <w:rFonts w:hint="eastAsia"/>
+        </w:rPr>
+        <w:t>:</w:t>
+      </w:r>
+      <w:r>
+        <w:t>http://127.0.0.1:5000/api?function=cloud&amp;token=123123&amp;pf=tencent</w:t>
+      </w:r>
+      <w:proofErr w:type="gramEnd"/>
+    </w:p>
+    <w:p>
+      <w:r>
+        <w:rPr>
+          <w:rFonts w:hint="eastAsia"/>
+        </w:rPr>
+        <w:t>Note</w:t>
+      </w:r>
+      <w:r>
+        <w:rPr>
+          <w:rFonts w:hint="eastAsia"/>
+        </w:rPr>
+        <w:t>:</w:t>
+      </w:r>
+      <w:r>
+        <w:t xml:space="preserve"> Request to process a video file</w:t>
+      </w:r>
+      <w:r>
+        <w:t xml:space="preserve"> </w:t>
+      </w:r>
+    </w:p>
+    <w:p>
+      <w:r>
+        <w:rPr>
+          <w:rFonts w:hint="eastAsia"/>
+        </w:rPr>
+        <w:t>Payload</w:t>
+      </w:r>
+      <w:r>
+        <w:rPr>
+          <w:rFonts w:hint="eastAsia"/>
+        </w:rPr>
+        <w:t>:</w:t>
+      </w:r>
+      <w:r>
+        <w:rPr>
+          <w:rFonts w:hint="eastAsia"/>
+        </w:rPr>
+        <w:t xml:space="preserve"> </w:t>
+      </w:r>
+    </w:p>
+    <w:p>
+      <w:r>
+        <w:t>{</w:t>
+      </w:r>
+    </w:p>
+    <w:p>
+      <w:r>
+        <w:t xml:space="preserve">    "</w:t>
+      </w:r>
+      <w:proofErr w:type="spellStart"/>
+      <w:r>
+        <w:t>tszTimeStart</w:t>
+      </w:r>
+      <w:proofErr w:type="spellEnd"/>
+      <w:r>
+        <w:t>": "2026-06-17 16:02:00",</w:t>
+      </w:r>
+    </w:p>
+    <w:p>
+      <w:r>
+        <w:t xml:space="preserve">    "</w:t>
+      </w:r>
+      <w:proofErr w:type="spellStart"/>
+      <w:r>
+        <w:t>tszEventID</w:t>
+      </w:r>
+      <w:proofErr w:type="spellEnd"/>
+      <w:r>
+        <w:t>": "1001",</w:t>
+      </w:r>
+    </w:p>
+    <w:p>
+      <w:r>
+        <w:t xml:space="preserve">    "</w:t>
+      </w:r>
+      <w:proofErr w:type="spellStart"/>
+      <w:r>
+        <w:t>nTimeDuration</w:t>
+      </w:r>
+      <w:proofErr w:type="spellEnd"/>
+      <w:r>
+        <w:t>": 30</w:t>
+      </w:r>
+    </w:p>
+    <w:p>
+      <w:pPr>
+        <w:ind w:left="440" w:hanging="440"/>
+      </w:pPr>
+      <w:r>
+        <w:t>}</w:t>
+      </w:r>
+    </w:p>
+    <w:p>
+      <w:pPr>
+        <w:pStyle w:val="a"/>
+      </w:pPr>
+      <w:proofErr w:type="spellStart"/>
+      <w:proofErr w:type="gramStart"/>
+      <w:r>
+        <w:t>tszTimeStart</w:t>
+      </w:r>
+      <w:r>
+        <w:rPr>
+          <w:rFonts w:hint="eastAsia"/>
+        </w:rPr>
+        <w:t>:</w:t>
+      </w:r>
+      <w:r>
+        <w:rPr>
+          <w:rFonts w:hint="eastAsia"/>
+        </w:rPr>
+        <w:t>Start</w:t>
+      </w:r>
+      <w:proofErr w:type="spellEnd"/>
+      <w:proofErr w:type="gramEnd"/>
+      <w:r>
+        <w:rPr>
+          <w:rFonts w:hint="eastAsia"/>
+        </w:rPr>
+        <w:t xml:space="preserve"> </w:t>
+      </w:r>
+      <w:proofErr w:type="spellStart"/>
+      <w:r>
+        <w:rPr>
+          <w:rFonts w:hint="eastAsia"/>
+        </w:rPr>
+        <w:t>tIME</w:t>
+      </w:r>
+      <w:proofErr w:type="spellEnd"/>
+    </w:p>
+    <w:p>
+      <w:pPr>
+        <w:pStyle w:val="a"/>
+      </w:pPr>
+      <w:proofErr w:type="spellStart"/>
+      <w:proofErr w:type="gramStart"/>
+      <w:r>
+        <w:t>tszEventID</w:t>
+      </w:r>
+      <w:r>
+        <w:rPr>
+          <w:rFonts w:hint="eastAsia"/>
+        </w:rPr>
+        <w:t>:</w:t>
+      </w:r>
+      <w:r>
+        <w:rPr>
+          <w:rFonts w:hint="eastAsia"/>
+        </w:rPr>
+        <w:t>E</w:t>
+      </w:r>
+      <w:r>
+        <w:t>v</w:t>
+      </w:r>
+      <w:r>
+        <w:rPr>
+          <w:rFonts w:hint="eastAsia"/>
+        </w:rPr>
+        <w:t>ent</w:t>
+      </w:r>
+      <w:proofErr w:type="spellEnd"/>
+      <w:proofErr w:type="gramEnd"/>
+      <w:r>
+        <w:rPr>
+          <w:rFonts w:hint="eastAsia"/>
+        </w:rPr>
+        <w:t xml:space="preserve"> </w:t>
+      </w:r>
+      <w:proofErr w:type="spellStart"/>
+      <w:proofErr w:type="gramStart"/>
+      <w:r>
+        <w:rPr>
+          <w:rFonts w:hint="eastAsia"/>
+        </w:rPr>
+        <w:t>ID,</w:t>
+      </w:r>
+      <w:r>
+        <w:rPr>
+          <w:rFonts w:hint="eastAsia"/>
+        </w:rPr>
+        <w:t>only</w:t>
+      </w:r>
+      <w:proofErr w:type="spellEnd"/>
+      <w:proofErr w:type="gramEnd"/>
+      <w:r>
+        <w:rPr>
+          <w:rFonts w:hint="eastAsia"/>
+        </w:rPr>
+        <w:t xml:space="preserve"> number</w:t>
+      </w:r>
+    </w:p>
+    <w:p>
+      <w:pPr>
+        <w:pStyle w:val="a"/>
+      </w:pPr>
+      <w:proofErr w:type="spellStart"/>
+      <w:proofErr w:type="gramStart"/>
+      <w:r>
+        <w:lastRenderedPageBreak/>
+        <w:t>nTimeDuration</w:t>
+      </w:r>
+      <w:r>
+        <w:rPr>
+          <w:rFonts w:hint="eastAsia"/>
+        </w:rPr>
+        <w:t>:</w:t>
+      </w:r>
+      <w:r>
+        <w:rPr>
+          <w:rFonts w:hint="eastAsia"/>
+        </w:rPr>
+        <w:t>video</w:t>
+      </w:r>
+      <w:proofErr w:type="spellEnd"/>
+      <w:proofErr w:type="gramEnd"/>
+      <w:r>
+        <w:rPr>
+          <w:rFonts w:hint="eastAsia"/>
+        </w:rPr>
+        <w:t xml:space="preserve"> duration</w:t>
+      </w:r>
+      <w:r>
+        <w:rPr>
+          <w:rFonts w:hint="eastAsia"/>
+        </w:rPr>
+        <w:t xml:space="preserve"> time</w:t>
+      </w:r>
+    </w:p>
+    <w:p>
+      <w:r>
+        <w:rPr>
+          <w:rFonts w:hint="eastAsia"/>
+        </w:rPr>
+        <w:t>format</w:t>
+      </w:r>
+      <w:r>
+        <w:rPr>
+          <w:rFonts w:hint="eastAsia"/>
+        </w:rPr>
+        <w:t xml:space="preserve"> </w:t>
+      </w:r>
+      <w:proofErr w:type="spellStart"/>
+      <w:r>
+        <w:rPr>
+          <w:rFonts w:hint="eastAsia"/>
+        </w:rPr>
+        <w:t>scte</w:t>
+      </w:r>
+      <w:proofErr w:type="spellEnd"/>
+      <w:r>
+        <w:rPr>
+          <w:rFonts w:hint="eastAsia"/>
+        </w:rPr>
+        <w:t xml:space="preserve"> 35</w:t>
+      </w:r>
+      <w:r>
+        <w:rPr>
+          <w:rFonts w:hint="eastAsia"/>
+        </w:rPr>
+        <w:t>:</w:t>
+      </w:r>
+    </w:p>
+    <w:p>
+      <w:r>
+        <w:t>* SCTE 35 Splice Information, TID 0xFC (252), PID 0x0111 (273)</w:t>
+      </w:r>
+    </w:p>
+    <w:p>
+      <w:r>
+        <w:t xml:space="preserve">  Short section, total size: 40 bytes</w:t>
+      </w:r>
+    </w:p>
+    <w:p>
+      <w:r>
+        <w:t xml:space="preserve">  - Section 0:</w:t>
+      </w:r>
+    </w:p>
+    <w:p>
+      <w:r>
+        <w:t xml:space="preserve">    Protocol version: 0</w:t>
+      </w:r>
+    </w:p>
+    <w:p>
+      <w:r>
+        <w:t xml:space="preserve">    Encryption: none</w:t>
+      </w:r>
+    </w:p>
+    <w:p>
+      <w:r>
+        <w:t xml:space="preserve">    PTS adjustment: 0x000000000</w:t>
+      </w:r>
+    </w:p>
+    <w:p>
+      <w:r>
+        <w:t xml:space="preserve">    CW index: 0x00 (0), tier: 0xFFF (4095)</w:t>
+      </w:r>
+    </w:p>
+    <w:p>
+      <w:r>
+        <w:t xml:space="preserve">    Command type: 0x05 (</w:t>
+      </w:r>
+      <w:proofErr w:type="spellStart"/>
+      <w:r>
+        <w:t>SpliceInsert</w:t>
+      </w:r>
+      <w:proofErr w:type="spellEnd"/>
+      <w:r>
+        <w:t>), size: 20 bytes</w:t>
+      </w:r>
+    </w:p>
+    <w:p>
+      <w:r>
+        <w:t xml:space="preserve">    Splice event id: 0x000003E9 (1001), cancel: 0</w:t>
+      </w:r>
+    </w:p>
+    <w:p>
+      <w:r>
+        <w:t xml:space="preserve">    Out of network: yes, program splice: yes, duration set: yes, immediate: no</w:t>
+      </w:r>
+    </w:p>
+    <w:p>
+      <w:r>
+        <w:t xml:space="preserve">    Time PTS: 0x000260232 (2,490,930, 27,677 </w:t>
+      </w:r>
+      <w:proofErr w:type="spellStart"/>
+      <w:r>
+        <w:t>ms</w:t>
+      </w:r>
+      <w:proofErr w:type="spellEnd"/>
+      <w:r>
+        <w:t>)</w:t>
+      </w:r>
+    </w:p>
+    <w:p>
+      <w:r>
+        <w:t xml:space="preserve">    Duration PTS: 0x0002932E0 (2,700,000, 30,000 </w:t>
+      </w:r>
+      <w:proofErr w:type="spellStart"/>
+      <w:r>
+        <w:t>ms</w:t>
+      </w:r>
+      <w:proofErr w:type="spellEnd"/>
+      <w:r>
+        <w:t>), auto return: yes</w:t>
+      </w:r>
+    </w:p>
+    <w:p>
+      <w:r>
+        <w:t xml:space="preserve">    Unique program id: 0x0001 (1), avail: 0x00 (0), avails expected: 0</w:t>
+      </w:r>
+    </w:p>
+    <w:p>
+      <w:r>
+        <w:t xml:space="preserve">    CRC32: 0xAC4E5C2E (OK)</w:t>
+      </w:r>
+    </w:p>
+    <w:p/>
+    <w:p>
+      <w:pPr>
         <w:pStyle w:val="1"/>
-        <w:rPr>
-          <w:rFonts w:hint="eastAsia"/>
-        </w:rPr>
-      </w:pPr>
-      <w:bookmarkStart w:id="42" w:name="_Toc231485096"/>
+      </w:pPr>
+      <w:bookmarkStart w:id="46" w:name="_Toc233732762"/>
       <w:r>
         <w:rPr>
           <w:rFonts w:hint="eastAsia"/>
@@ -14682,7 +15128,7 @@
         </w:rPr>
         <w:t>Start Mode</w:t>
       </w:r>
-      <w:bookmarkEnd w:id="42"/>
+      <w:bookmarkEnd w:id="46"/>
     </w:p>
     <w:p>
       <w:pPr>
@@ -14699,7 +15145,7 @@
       <w:pPr>
         <w:pStyle w:val="2"/>
       </w:pPr>
-      <w:bookmarkStart w:id="43" w:name="_Toc231485097"/>
+      <w:bookmarkStart w:id="47" w:name="_Toc233732763"/>
       <w:r>
         <w:rPr>
           <w:rFonts w:hint="eastAsia"/>
@@ -14709,7 +15155,7 @@
       <w:r>
         <w:t>Service Startup</w:t>
       </w:r>
-      <w:bookmarkEnd w:id="43"/>
+      <w:bookmarkEnd w:id="47"/>
     </w:p>
     <w:p>
       <w:pPr>
@@ -14740,9 +15186,6 @@
     <w:p>
       <w:pPr>
         <w:ind w:firstLineChars="200" w:firstLine="420"/>
-        <w:rPr>
-          <w:rFonts w:hint="eastAsia"/>
-        </w:rPr>
       </w:pPr>
       <w:r>
         <w:t>It can also run automatically as a daemon process in the background; just add the parameter -d 1</w:t>
@@ -14752,7 +15195,7 @@
       <w:pPr>
         <w:pStyle w:val="2"/>
       </w:pPr>
-      <w:bookmarkStart w:id="44" w:name="_Toc231485098"/>
+      <w:bookmarkStart w:id="48" w:name="_Toc233732764"/>
       <w:r>
         <w:rPr>
           <w:rFonts w:hint="eastAsia"/>
@@ -14767,7 +15210,7 @@
       <w:r>
         <w:t xml:space="preserve"> startup</w:t>
       </w:r>
-      <w:bookmarkEnd w:id="44"/>
+      <w:bookmarkEnd w:id="48"/>
     </w:p>
     <w:p>
       <w:pPr>
@@ -14790,39 +15233,251 @@
       </w:r>
       <w:proofErr w:type="spellEnd"/>
       <w:r>
-        <w:t xml:space="preserve"> -m -p 5001 means using multi-processing mode and listening on </w:t>
-      </w:r>
-      <w:r>
+        <w:t xml:space="preserve"> -m -p 5001 means using multi-processing mode and listening on port 5001. If you want to start the second instance, you can </w:t>
+      </w:r>
+      <w:proofErr w:type="gramStart"/>
+      <w:r>
+        <w:t>use .</w:t>
+      </w:r>
+      <w:proofErr w:type="gramEnd"/>
+      <w:r>
+        <w:t>/</w:t>
+      </w:r>
+      <w:proofErr w:type="spellStart"/>
+      <w:r>
+        <w:t>AVCodec_XServiceApp</w:t>
+      </w:r>
+      <w:proofErr w:type="spellEnd"/>
+      <w:r>
+        <w:t xml:space="preserve"> -m -p 5002. In this case, the port number must not be duplicated and must not be in use. If it fails, it will immediately return a non-zero value.</w:t>
+      </w:r>
+    </w:p>
+    <w:p>
+      <w:pPr>
+        <w:pStyle w:val="1"/>
+      </w:pPr>
+      <w:bookmarkStart w:id="49" w:name="_Toc233732765"/>
+      <w:r>
+        <w:rPr>
+          <w:rFonts w:hint="eastAsia"/>
+        </w:rPr>
         <w:lastRenderedPageBreak/>
-        <w:t xml:space="preserve">port 5001. If you want to start the second instance, you can </w:t>
-      </w:r>
-      <w:proofErr w:type="gramStart"/>
-      <w:r>
-        <w:t>use .</w:t>
-      </w:r>
-      <w:proofErr w:type="gramEnd"/>
+        <w:t>三</w:t>
+      </w:r>
+      <w:r>
+        <w:rPr>
+          <w:rFonts w:hint="eastAsia"/>
+        </w:rPr>
+        <w:t xml:space="preserve"> </w:t>
+      </w:r>
+      <w:r>
+        <w:rPr>
+          <w:rFonts w:hint="eastAsia"/>
+        </w:rPr>
+        <w:t>Configure File</w:t>
+      </w:r>
+      <w:bookmarkEnd w:id="49"/>
+    </w:p>
+    <w:p>
+      <w:pPr>
+        <w:ind w:firstLineChars="200" w:firstLine="420"/>
+      </w:pPr>
+      <w:r>
+        <w:t>Configuration files generally do not need to be modified</w:t>
+      </w:r>
+    </w:p>
+    <w:p>
+      <w:pPr>
+        <w:ind w:firstLineChars="200" w:firstLine="420"/>
+      </w:pPr>
+      <w:r>
+        <w:t xml:space="preserve">The configuration file is at </w:t>
+      </w:r>
+      <w:proofErr w:type="spellStart"/>
+      <w:r>
+        <w:t>XEngine_Config</w:t>
+      </w:r>
+      <w:proofErr w:type="spellEnd"/>
       <w:r>
         <w:t>/</w:t>
       </w:r>
       <w:proofErr w:type="spellStart"/>
       <w:r>
-        <w:t>AVCodec_XServiceApp</w:t>
-      </w:r>
-      <w:proofErr w:type="spellEnd"/>
-      <w:r>
-        <w:t xml:space="preserve"> -m -p 5002. In this case, the port number must not be duplicated and must not be in use. If it fails, it will immediately return a non-zero value.</w:t>
+        <w:t>XEngine_HttpConfig.json</w:t>
+      </w:r>
+      <w:proofErr w:type="spellEnd"/>
+    </w:p>
+    <w:p>
+      <w:pPr>
+        <w:ind w:firstLineChars="200" w:firstLine="420"/>
+      </w:pPr>
+      <w:r>
+        <w:t>The key configurations are as follows:</w:t>
+      </w:r>
+    </w:p>
+    <w:p>
+      <w:pPr>
+        <w:ind w:firstLineChars="200" w:firstLine="420"/>
+      </w:pPr>
+      <w:proofErr w:type="spellStart"/>
+      <w:r>
+        <w:t>nPort</w:t>
+      </w:r>
+      <w:proofErr w:type="spellEnd"/>
+      <w:r>
+        <w:t>: binds the communication port, the -p parameter corresponds to</w:t>
+      </w:r>
+    </w:p>
+    <w:p>
+      <w:pPr>
+        <w:pStyle w:val="2"/>
+      </w:pPr>
+      <w:bookmarkStart w:id="50" w:name="_Toc233732766"/>
+      <w:r>
+        <w:rPr>
+          <w:rFonts w:hint="eastAsia"/>
+        </w:rPr>
+        <w:t xml:space="preserve">3.1 </w:t>
+      </w:r>
+      <w:proofErr w:type="spellStart"/>
+      <w:r>
+        <w:rPr>
+          <w:rFonts w:hint="eastAsia"/>
+        </w:rPr>
+        <w:t>XMax</w:t>
+      </w:r>
+      <w:bookmarkEnd w:id="50"/>
+      <w:proofErr w:type="spellEnd"/>
+    </w:p>
+    <w:p>
+      <w:r>
+        <w:rPr>
+          <w:rFonts w:hint="eastAsia"/>
+        </w:rPr>
+        <w:t xml:space="preserve">   </w:t>
+      </w:r>
+      <w:r>
+        <w:rPr>
+          <w:rFonts w:hint="eastAsia"/>
+        </w:rPr>
+        <w:t xml:space="preserve"> </w:t>
+      </w:r>
+      <w:r>
+        <w:t>Server Performance Configuration</w:t>
+      </w:r>
+    </w:p>
+    <w:p>
+      <w:pPr>
+        <w:pStyle w:val="2"/>
+      </w:pPr>
+      <w:bookmarkStart w:id="51" w:name="_Toc233732767"/>
+      <w:r>
+        <w:rPr>
+          <w:rFonts w:hint="eastAsia"/>
+        </w:rPr>
+        <w:t xml:space="preserve">3.2 </w:t>
+      </w:r>
+      <w:proofErr w:type="spellStart"/>
+      <w:r>
+        <w:rPr>
+          <w:rFonts w:hint="eastAsia"/>
+        </w:rPr>
+        <w:t>XTime</w:t>
+      </w:r>
+      <w:bookmarkEnd w:id="51"/>
+      <w:proofErr w:type="spellEnd"/>
+    </w:p>
+    <w:p>
+      <w:pPr>
+        <w:ind w:firstLineChars="200" w:firstLine="420"/>
+      </w:pPr>
+      <w:r>
+        <w:t>Server Timeout Configuration</w:t>
+      </w:r>
+    </w:p>
+    <w:p>
+      <w:pPr>
+        <w:pStyle w:val="2"/>
+      </w:pPr>
+      <w:bookmarkStart w:id="52" w:name="_Toc233732768"/>
+      <w:r>
+        <w:rPr>
+          <w:rFonts w:hint="eastAsia"/>
+        </w:rPr>
+        <w:t xml:space="preserve">3.3 </w:t>
+      </w:r>
+      <w:proofErr w:type="spellStart"/>
+      <w:r>
+        <w:rPr>
+          <w:rFonts w:hint="eastAsia"/>
+        </w:rPr>
+        <w:t>XLog</w:t>
+      </w:r>
+      <w:bookmarkEnd w:id="52"/>
+      <w:proofErr w:type="spellEnd"/>
+    </w:p>
+    <w:p>
+      <w:pPr>
+        <w:ind w:firstLine="420"/>
+      </w:pPr>
+      <w:r>
+        <w:rPr>
+          <w:rFonts w:hint="eastAsia"/>
+        </w:rPr>
+        <w:t>Log Configure</w:t>
+      </w:r>
+    </w:p>
+    <w:p>
+      <w:pPr>
+        <w:pStyle w:val="2"/>
+      </w:pPr>
+      <w:bookmarkStart w:id="53" w:name="_Toc233732769"/>
+      <w:r>
+        <w:rPr>
+          <w:rFonts w:hint="eastAsia"/>
+        </w:rPr>
+        <w:t>3.</w:t>
+      </w:r>
+      <w:r>
+        <w:rPr>
+          <w:rFonts w:hint="eastAsia"/>
+        </w:rPr>
+        <w:t>4</w:t>
+      </w:r>
+      <w:r>
+        <w:rPr>
+          <w:rFonts w:hint="eastAsia"/>
+        </w:rPr>
+        <w:t xml:space="preserve"> </w:t>
+      </w:r>
+      <w:r>
+        <w:t>XStream</w:t>
+      </w:r>
+      <w:bookmarkEnd w:id="53"/>
+    </w:p>
+    <w:p>
+      <w:pPr>
+        <w:ind w:firstLineChars="200" w:firstLine="420"/>
+      </w:pPr>
+      <w:proofErr w:type="spellStart"/>
+      <w:r>
+        <w:t>nMuxRate</w:t>
+      </w:r>
+      <w:proofErr w:type="spellEnd"/>
+      <w:r>
+        <w:t>: Indicates the size of the multiplexing bitrate, converted to a fixed bitrate. For example, 1 means adding a +1M bitrate to the original video, which is not supported for live streams</w:t>
       </w:r>
     </w:p>
     <w:p>
       <w:pPr>
         <w:pStyle w:val="1"/>
       </w:pPr>
-      <w:bookmarkStart w:id="45" w:name="_Toc231485099"/>
-      <w:r>
-        <w:rPr>
-          <w:rFonts w:hint="eastAsia"/>
-        </w:rPr>
-        <w:t>三</w:t>
+      <w:bookmarkStart w:id="54" w:name="_Toc233732770"/>
+      <w:r>
+        <w:rPr>
+          <w:rFonts w:hint="eastAsia"/>
+        </w:rPr>
+        <w:t>四</w:t>
       </w:r>
       <w:r>
         <w:rPr>
@@ -14834,16 +15489,49 @@
         <w:rPr>
           <w:rFonts w:hint="eastAsia"/>
         </w:rPr>
-        <w:t>Configure File</w:t>
-      </w:r>
-      <w:bookmarkEnd w:id="45"/>
+        <w:t>Start Command</w:t>
+      </w:r>
+      <w:bookmarkEnd w:id="54"/>
+    </w:p>
+    <w:p>
+      <w:pPr>
+        <w:ind w:firstLine="420"/>
+      </w:pPr>
+      <w:r>
+        <w:t>Supports more startup commands. If you need more detailed logs, you can use the -l debug parameter to set the log level to debug. The default is -l info level. If you are testing and verifying issues, use -l detail for detailed logs, and -l debug for maximum logs. Start with parameters</w:t>
+      </w:r>
+    </w:p>
+    <w:p>
+      <w:pPr>
+        <w:pStyle w:val="1"/>
+      </w:pPr>
+      <w:bookmarkStart w:id="55" w:name="_Toc233732771"/>
+      <w:r>
+        <w:rPr>
+          <w:rFonts w:hint="eastAsia"/>
+        </w:rPr>
+        <w:t>五</w:t>
+      </w:r>
+      <w:r>
+        <w:rPr>
+          <w:rFonts w:hint="eastAsia"/>
+        </w:rPr>
+        <w:t xml:space="preserve"> HTTP</w:t>
+      </w:r>
+      <w:r>
+        <w:rPr>
+          <w:rFonts w:hint="eastAsia"/>
+        </w:rPr>
+        <w:t xml:space="preserve"> Verification</w:t>
+      </w:r>
+      <w:bookmarkEnd w:id="55"/>
     </w:p>
     <w:p>
       <w:pPr>
         <w:ind w:firstLineChars="200" w:firstLine="420"/>
       </w:pPr>
       <w:r>
-        <w:t>Configuration files generally do not need to be modified</w:t>
+        <w:t>Now enable HTTP interface authentication. When processing HTTP interfaces, the authentication function needs to be added. The Request client should support both Basic and Digest authentication methods by default. The default interface username and password are: username: 123123aa, password: 123123</w:t>
       </w:r>
     </w:p>
     <w:p>
@@ -14851,329 +15539,48 @@
         <w:ind w:firstLineChars="200" w:firstLine="420"/>
       </w:pPr>
       <w:r>
-        <w:t xml:space="preserve">The configuration file is at </w:t>
-      </w:r>
-      <w:proofErr w:type="spellStart"/>
-      <w:r>
-        <w:t>XEngine_Config</w:t>
-      </w:r>
-      <w:proofErr w:type="spellEnd"/>
-      <w:r>
-        <w:t>/</w:t>
-      </w:r>
-      <w:proofErr w:type="spellStart"/>
-      <w:r>
-        <w:t>XEngine_HttpConfig.json</w:t>
-      </w:r>
-      <w:proofErr w:type="spellEnd"/>
-    </w:p>
-    <w:p>
-      <w:pPr>
-        <w:ind w:firstLineChars="200" w:firstLine="420"/>
-      </w:pPr>
-      <w:r>
-        <w:t>The key configurations are as follows:</w:t>
-      </w:r>
-    </w:p>
-    <w:p>
-      <w:pPr>
-        <w:ind w:firstLineChars="200" w:firstLine="420"/>
-        <w:rPr>
-          <w:rFonts w:hint="eastAsia"/>
-        </w:rPr>
-      </w:pPr>
-      <w:proofErr w:type="spellStart"/>
-      <w:r>
-        <w:t>nPort</w:t>
-      </w:r>
-      <w:proofErr w:type="spellEnd"/>
-      <w:r>
-        <w:t>: binds the communication port, the -p parameter corresponds to</w:t>
-      </w:r>
+        <w:lastRenderedPageBreak/>
+        <w:t xml:space="preserve">If you need to close it, please set </w:t>
+      </w:r>
+      <w:proofErr w:type="spellStart"/>
+      <w:r>
+        <w:t>bEnable</w:t>
+      </w:r>
+      <w:proofErr w:type="spellEnd"/>
+      <w:r>
+        <w:t xml:space="preserve"> of </w:t>
+      </w:r>
+      <w:proofErr w:type="spellStart"/>
+      <w:r>
+        <w:t>XHttpVer</w:t>
+      </w:r>
+      <w:proofErr w:type="spellEnd"/>
+      <w:r>
+        <w:t xml:space="preserve"> to false</w:t>
+      </w:r>
+    </w:p>
+    <w:p>
+      <w:pPr>
+        <w:pStyle w:val="1"/>
+      </w:pPr>
+      <w:bookmarkStart w:id="56" w:name="_Toc233732772"/>
+      <w:r>
+        <w:t>Appendix</w:t>
+      </w:r>
+      <w:bookmarkEnd w:id="56"/>
     </w:p>
     <w:p>
       <w:pPr>
         <w:pStyle w:val="2"/>
       </w:pPr>
-      <w:bookmarkStart w:id="46" w:name="_Toc231485100"/>
-      <w:r>
-        <w:rPr>
-          <w:rFonts w:hint="eastAsia"/>
-        </w:rPr>
-        <w:t xml:space="preserve">3.1 </w:t>
-      </w:r>
-      <w:proofErr w:type="spellStart"/>
-      <w:r>
-        <w:rPr>
-          <w:rFonts w:hint="eastAsia"/>
-        </w:rPr>
-        <w:t>XMax</w:t>
-      </w:r>
-      <w:bookmarkEnd w:id="46"/>
-      <w:proofErr w:type="spellEnd"/>
-    </w:p>
-    <w:p>
-      <w:r>
-        <w:rPr>
-          <w:rFonts w:hint="eastAsia"/>
-        </w:rPr>
-        <w:t xml:space="preserve">   </w:t>
-      </w:r>
-      <w:r>
-        <w:rPr>
-          <w:rFonts w:hint="eastAsia"/>
-        </w:rPr>
-        <w:t xml:space="preserve"> </w:t>
-      </w:r>
-      <w:r>
-        <w:t>Server Performance Configuration</w:t>
-      </w:r>
-    </w:p>
-    <w:p>
-      <w:pPr>
-        <w:pStyle w:val="2"/>
-      </w:pPr>
-      <w:bookmarkStart w:id="47" w:name="_Toc231485101"/>
-      <w:r>
-        <w:rPr>
-          <w:rFonts w:hint="eastAsia"/>
-        </w:rPr>
-        <w:t xml:space="preserve">3.2 </w:t>
-      </w:r>
-      <w:proofErr w:type="spellStart"/>
-      <w:r>
-        <w:rPr>
-          <w:rFonts w:hint="eastAsia"/>
-        </w:rPr>
-        <w:t>XTime</w:t>
-      </w:r>
-      <w:bookmarkEnd w:id="47"/>
-      <w:proofErr w:type="spellEnd"/>
-    </w:p>
-    <w:p>
-      <w:pPr>
-        <w:ind w:firstLineChars="200" w:firstLine="420"/>
-        <w:rPr>
-          <w:rFonts w:hint="eastAsia"/>
-        </w:rPr>
-      </w:pPr>
-      <w:r>
-        <w:t>Server Timeout Configuration</w:t>
-      </w:r>
-    </w:p>
-    <w:p>
-      <w:pPr>
-        <w:pStyle w:val="2"/>
-      </w:pPr>
-      <w:bookmarkStart w:id="48" w:name="_Toc231485102"/>
-      <w:r>
-        <w:rPr>
-          <w:rFonts w:hint="eastAsia"/>
-        </w:rPr>
-        <w:t xml:space="preserve">3.3 </w:t>
-      </w:r>
-      <w:proofErr w:type="spellStart"/>
-      <w:r>
-        <w:rPr>
-          <w:rFonts w:hint="eastAsia"/>
-        </w:rPr>
-        <w:t>XLog</w:t>
-      </w:r>
-      <w:bookmarkEnd w:id="48"/>
-      <w:proofErr w:type="spellEnd"/>
-    </w:p>
-    <w:p>
-      <w:pPr>
-        <w:ind w:firstLine="420"/>
-        <w:rPr>
-          <w:rFonts w:hint="eastAsia"/>
-        </w:rPr>
-      </w:pPr>
-      <w:r>
-        <w:rPr>
-          <w:rFonts w:hint="eastAsia"/>
-        </w:rPr>
-        <w:t>Log Configure</w:t>
-      </w:r>
-    </w:p>
-    <w:p>
-      <w:pPr>
-        <w:pStyle w:val="2"/>
-      </w:pPr>
-      <w:bookmarkStart w:id="49" w:name="_Toc231485103"/>
-      <w:r>
-        <w:rPr>
-          <w:rFonts w:hint="eastAsia"/>
-        </w:rPr>
-        <w:t>3.</w:t>
-      </w:r>
-      <w:r>
-        <w:rPr>
-          <w:rFonts w:hint="eastAsia"/>
-        </w:rPr>
-        <w:t>4</w:t>
-      </w:r>
-      <w:r>
-        <w:rPr>
-          <w:rFonts w:hint="eastAsia"/>
-        </w:rPr>
-        <w:t xml:space="preserve"> </w:t>
-      </w:r>
-      <w:r>
-        <w:t>XStream</w:t>
-      </w:r>
-      <w:bookmarkEnd w:id="49"/>
-    </w:p>
-    <w:p>
-      <w:pPr>
-        <w:ind w:firstLineChars="200" w:firstLine="420"/>
-        <w:rPr>
-          <w:rFonts w:hint="eastAsia"/>
-        </w:rPr>
-      </w:pPr>
-      <w:proofErr w:type="spellStart"/>
-      <w:r>
-        <w:t>nMuxRate</w:t>
-      </w:r>
-      <w:proofErr w:type="spellEnd"/>
-      <w:r>
-        <w:t>: Indicates the size of the multiplexing bitrate, converted to a fixed bitrate. For example, 1 means adding a +1M bitrate to the original video, which is not supported for live streams</w:t>
-      </w:r>
-    </w:p>
-    <w:p>
-      <w:pPr>
-        <w:pStyle w:val="1"/>
-        <w:rPr>
-          <w:rFonts w:hint="eastAsia"/>
-        </w:rPr>
-      </w:pPr>
-      <w:bookmarkStart w:id="50" w:name="_Toc231485104"/>
-      <w:r>
-        <w:rPr>
-          <w:rFonts w:hint="eastAsia"/>
-        </w:rPr>
-        <w:t>四</w:t>
-      </w:r>
-      <w:r>
-        <w:rPr>
-          <w:rFonts w:hint="eastAsia"/>
-        </w:rPr>
-        <w:t xml:space="preserve"> </w:t>
-      </w:r>
-      <w:r>
-        <w:rPr>
-          <w:rFonts w:hint="eastAsia"/>
-        </w:rPr>
-        <w:t>Start Command</w:t>
-      </w:r>
-      <w:bookmarkEnd w:id="50"/>
-    </w:p>
-    <w:p>
-      <w:pPr>
-        <w:ind w:firstLine="420"/>
-      </w:pPr>
-      <w:r>
-        <w:t>Supports more startup commands. If you need more detailed logs, you can use the -l debug parameter to set the log level to debug. The default is -l info level. If you are testing and verifying issues, use -l detail for detailed logs, and -l debug for maximum logs. Start with parameters</w:t>
-      </w:r>
-    </w:p>
-    <w:p>
-      <w:pPr>
-        <w:pStyle w:val="1"/>
-      </w:pPr>
-      <w:bookmarkStart w:id="51" w:name="_Toc231485105"/>
-      <w:r>
-        <w:rPr>
-          <w:rFonts w:hint="eastAsia"/>
-        </w:rPr>
-        <w:lastRenderedPageBreak/>
-        <w:t>五</w:t>
-      </w:r>
-      <w:r>
-        <w:rPr>
-          <w:rFonts w:hint="eastAsia"/>
-        </w:rPr>
-        <w:t xml:space="preserve"> HTTP</w:t>
-      </w:r>
-      <w:r>
-        <w:rPr>
-          <w:rFonts w:hint="eastAsia"/>
-        </w:rPr>
-        <w:t xml:space="preserve"> Verification</w:t>
-      </w:r>
-      <w:bookmarkEnd w:id="51"/>
-    </w:p>
-    <w:p>
-      <w:pPr>
-        <w:ind w:firstLineChars="200" w:firstLine="420"/>
-      </w:pPr>
-      <w:r>
-        <w:t>Now enable HTTP interface authentication. When processing HTTP interfaces, the authentication function needs to be added. The Request client should support both Basic and Digest authentication methods by default. The default interface username and password are: username: 123123aa, password: 123123</w:t>
-      </w:r>
-    </w:p>
-    <w:p>
-      <w:pPr>
-        <w:ind w:firstLineChars="200" w:firstLine="420"/>
-        <w:rPr>
-          <w:rFonts w:hint="eastAsia"/>
-        </w:rPr>
-      </w:pPr>
-      <w:r>
-        <w:t xml:space="preserve">If you need to close it, please set </w:t>
-      </w:r>
-      <w:proofErr w:type="spellStart"/>
-      <w:r>
-        <w:t>bEnable</w:t>
-      </w:r>
-      <w:proofErr w:type="spellEnd"/>
-      <w:r>
-        <w:t xml:space="preserve"> of </w:t>
-      </w:r>
-      <w:proofErr w:type="spellStart"/>
-      <w:r>
-        <w:t>XHttpVer</w:t>
-      </w:r>
-      <w:proofErr w:type="spellEnd"/>
-      <w:r>
-        <w:t xml:space="preserve"> to false</w:t>
-      </w:r>
-    </w:p>
-    <w:p>
-      <w:pPr>
-        <w:pStyle w:val="1"/>
-      </w:pPr>
-      <w:bookmarkStart w:id="52" w:name="_Toc231485106"/>
-      <w:r>
-        <w:t>Appendix</w:t>
-      </w:r>
-      <w:bookmarkEnd w:id="52"/>
-    </w:p>
-    <w:p>
-      <w:pPr>
-        <w:pStyle w:val="2"/>
-        <w:rPr>
-          <w:rFonts w:hint="eastAsia"/>
-        </w:rPr>
-      </w:pPr>
-      <w:bookmarkStart w:id="53" w:name="_Toc231485107"/>
-      <w:r>
-        <w:rPr>
-          <w:rFonts w:hint="eastAsia"/>
-        </w:rPr>
-        <w:t>Appendix</w:t>
-      </w:r>
-      <w:r>
-        <w:rPr>
-          <w:rFonts w:hint="eastAsia"/>
-        </w:rPr>
-        <w:t xml:space="preserve"> </w:t>
-      </w:r>
-      <w:r>
-        <w:rPr>
-          <w:rFonts w:hint="eastAsia"/>
-        </w:rPr>
-        <w:t>update log</w:t>
-      </w:r>
-      <w:bookmarkEnd w:id="53"/>
+      <w:bookmarkStart w:id="57" w:name="_Toc233732773"/>
+      <w:r>
+        <w:rPr>
+          <w:rFonts w:hint="eastAsia"/>
+        </w:rPr>
+        <w:t>Appendix update log</w:t>
+      </w:r>
+      <w:bookmarkEnd w:id="57"/>
     </w:p>
     <w:tbl>
       <w:tblPr>
@@ -15194,11 +15601,6 @@
             <w:tcW w:w="1629" w:type="dxa"/>
           </w:tcPr>
           <w:p>
-            <w:pPr>
-              <w:rPr>
-                <w:rFonts w:hint="eastAsia"/>
-              </w:rPr>
-            </w:pPr>
             <w:r>
               <w:rPr>
                 <w:rFonts w:hint="eastAsia"/>
@@ -15212,11 +15614,6 @@
             <w:tcW w:w="4545" w:type="dxa"/>
           </w:tcPr>
           <w:p>
-            <w:pPr>
-              <w:rPr>
-                <w:rFonts w:hint="eastAsia"/>
-              </w:rPr>
-            </w:pPr>
             <w:r>
               <w:rPr>
                 <w:rFonts w:hint="eastAsia"/>
@@ -15230,11 +15627,6 @@
             <w:tcW w:w="930" w:type="dxa"/>
           </w:tcPr>
           <w:p>
-            <w:pPr>
-              <w:rPr>
-                <w:rFonts w:hint="eastAsia"/>
-              </w:rPr>
-            </w:pPr>
             <w:r>
               <w:rPr>
                 <w:rFonts w:hint="eastAsia"/>
@@ -15248,11 +15640,6 @@
             <w:tcW w:w="1192" w:type="dxa"/>
           </w:tcPr>
           <w:p>
-            <w:pPr>
-              <w:rPr>
-                <w:rFonts w:hint="eastAsia"/>
-              </w:rPr>
-            </w:pPr>
             <w:r>
               <w:rPr>
                 <w:rFonts w:hint="eastAsia"/>
@@ -15265,12 +15652,8 @@
     </w:tbl>
     <w:p/>
     <w:sectPr>
-      <w:headerReference w:type="even" r:id="rId12"/>
-      <w:headerReference w:type="default" r:id="rId13"/>
-      <w:footerReference w:type="even" r:id="rId14"/>
-      <w:footerReference w:type="default" r:id="rId15"/>
-      <w:headerReference w:type="first" r:id="rId16"/>
-      <w:footerReference w:type="first" r:id="rId17"/>
+      <w:headerReference w:type="default" r:id="rId12"/>
+      <w:footerReference w:type="default" r:id="rId13"/>
       <w:pgSz w:w="11906" w:h="16838"/>
       <w:pgMar w:top="1440" w:right="1800" w:bottom="1440" w:left="1800" w:header="851" w:footer="992" w:gutter="0"/>
       <w:cols w:space="425"/>
@@ -15300,16 +15683,6 @@
 </file>
 
 <file path=word/footer1.xml><?xml version="1.0" encoding="utf-8"?>
-<w:ftr xmlns:wpc="http://schemas.microsoft.com/office/word/2010/wordprocessingCanvas" xmlns:cx="http://schemas.microsoft.com/office/drawing/2014/chartex" xmlns:cx1="http://schemas.microsoft.com/office/drawing/2015/9/8/chartex" xmlns:cx2="http://schemas.microsoft.com/office/drawing/2015/10/21/chartex" xmlns:cx3="http://schemas.microsoft.com/office/drawing/2016/5/9/chartex" xmlns:cx4="http://schemas.microsoft.com/office/drawing/2016/5/10/chartex" xmlns:cx5="http://schemas.microsoft.com/office/drawing/2016/5/11/chartex" xmlns:cx6="http://schemas.microsoft.com/office/drawing/2016/5/12/chartex" xmlns:cx7="http://schemas.microsoft.com/office/drawing/2016/5/13/chartex" xmlns:cx8="http://schemas.microsoft.com/office/drawing/2016/5/14/chartex" xmlns:mc="http://schemas.openxmlformats.org/markup-compatibility/2006" xmlns:aink="http://schemas.microsoft.com/office/drawing/2016/ink" xmlns:am3d="http://schemas.microsoft.com/office/drawing/2017/model3d" xmlns:o="urn:schemas-microsoft-com:office:office" xmlns:oel="http://schemas.microsoft.com/office/2019/extlst" xmlns:r="http://schemas.openxmlformats.org/officeDocument/2006/relationships" xmlns:m="http://schemas.openxmlformats.org/officeDocument/2006/math" xmlns:v="urn:schemas-microsoft-com:vml" xmlns:wp14="http://schemas.microsoft.com/office/word/2010/wordprocessingDrawing" xmlns:wp="http://schemas.openxmlformats.org/drawingml/2006/wordprocessingDrawing" xmlns:w10="urn:schemas-microsoft-com:office:word" xmlns:w="http://schemas.openxmlformats.org/wordprocessingml/2006/main" xmlns:w14="http://schemas.microsoft.com/office/word/2010/wordml" xmlns:w15="http://schemas.microsoft.com/office/word/2012/wordml" xmlns:w16cex="http://schemas.microsoft.com/office/word/2018/wordml/cex" xmlns:w16cid="http://schemas.microsoft.com/office/word/2016/wordml/cid" xmlns:w16="http://schemas.microsoft.com/office/word/2018/wordml" xmlns:w16du="http://schemas.microsoft.com/office/word/2023/wordml/word16du" xmlns:w16sdtdh="http://schemas.microsoft.com/office/word/2020/wordml/sdtdatahash" xmlns:w16sdtfl="http://schemas.microsoft.com/office/word/2024/wordml/sdtformatlock" xmlns:w16se="http://schemas.microsoft.com/office/word/2015/wordml/symex" xmlns:wpg="http://schemas.microsoft.com/office/word/2010/wordprocessingGroup" xmlns:wpi="http://schemas.microsoft.com/office/word/2010/wordprocessingInk" xmlns:wne="http://schemas.microsoft.com/office/word/2006/wordml" xmlns:wps="http://schemas.microsoft.com/office/word/2010/wordprocessingShape" mc:Ignorable="w14 w15 w16se w16cid w16 w16cex w16sdtdh w16sdtfl w16du wp14">
-  <w:p>
-    <w:pPr>
-      <w:pStyle w:val="a4"/>
-    </w:pPr>
-  </w:p>
-</w:ftr>
-</file>
-
-<file path=word/footer2.xml><?xml version="1.0" encoding="utf-8"?>
 <w:ftr xmlns:wpc="http://schemas.microsoft.com/office/word/2010/wordprocessingCanvas" xmlns:cx="http://schemas.microsoft.com/office/drawing/2014/chartex" xmlns:cx1="http://schemas.microsoft.com/office/drawing/2015/9/8/chartex" xmlns:cx2="http://schemas.microsoft.com/office/drawing/2015/10/21/chartex" xmlns:cx3="http://schemas.microsoft.com/office/drawing/2016/5/9/chartex" xmlns:cx4="http://schemas.microsoft.com/office/drawing/2016/5/10/chartex" xmlns:cx5="http://schemas.microsoft.com/office/drawing/2016/5/11/chartex" xmlns:cx6="http://schemas.microsoft.com/office/drawing/2016/5/12/chartex" xmlns:cx7="http://schemas.microsoft.com/office/drawing/2016/5/13/chartex" xmlns:cx8="http://schemas.microsoft.com/office/drawing/2016/5/14/chartex" xmlns:mc="http://schemas.openxmlformats.org/markup-compatibility/2006" xmlns:aink="http://schemas.microsoft.com/office/drawing/2016/ink" xmlns:am3d="http://schemas.microsoft.com/office/drawing/2017/model3d" xmlns:o="urn:schemas-microsoft-com:office:office" xmlns:oel="http://schemas.microsoft.com/office/2019/extlst" xmlns:r="http://schemas.openxmlformats.org/officeDocument/2006/relationships" xmlns:m="http://schemas.openxmlformats.org/officeDocument/2006/math" xmlns:v="urn:schemas-microsoft-com:vml" xmlns:wp14="http://schemas.microsoft.com/office/word/2010/wordprocessingDrawing" xmlns:wp="http://schemas.openxmlformats.org/drawingml/2006/wordprocessingDrawing" xmlns:w10="urn:schemas-microsoft-com:office:word" xmlns:w="http://schemas.openxmlformats.org/wordprocessingml/2006/main" xmlns:w14="http://schemas.microsoft.com/office/word/2010/wordml" xmlns:w15="http://schemas.microsoft.com/office/word/2012/wordml" xmlns:w16cex="http://schemas.microsoft.com/office/word/2018/wordml/cex" xmlns:w16cid="http://schemas.microsoft.com/office/word/2016/wordml/cid" xmlns:w16="http://schemas.microsoft.com/office/word/2018/wordml" xmlns:w16du="http://schemas.microsoft.com/office/word/2023/wordml/word16du" xmlns:w16sdtdh="http://schemas.microsoft.com/office/word/2020/wordml/sdtdatahash" xmlns:w16sdtfl="http://schemas.microsoft.com/office/word/2024/wordml/sdtformatlock" xmlns:w16se="http://schemas.microsoft.com/office/word/2015/wordml/symex" xmlns:wpg="http://schemas.microsoft.com/office/word/2010/wordprocessingGroup" xmlns:wpi="http://schemas.microsoft.com/office/word/2010/wordprocessingInk" xmlns:wne="http://schemas.microsoft.com/office/word/2006/wordml" xmlns:wps="http://schemas.microsoft.com/office/word/2010/wordprocessingShape" mc:Ignorable="w14 w15 w16se w16cid w16 w16cex w16sdtdh w16sdtfl w16du wp14">
   <w:p>
     <w:pPr>
@@ -15475,16 +15848,6 @@
 </w:ftr>
 </file>
 
-<file path=word/footer3.xml><?xml version="1.0" encoding="utf-8"?>
-<w:ftr xmlns:wpc="http://schemas.microsoft.com/office/word/2010/wordprocessingCanvas" xmlns:cx="http://schemas.microsoft.com/office/drawing/2014/chartex" xmlns:cx1="http://schemas.microsoft.com/office/drawing/2015/9/8/chartex" xmlns:cx2="http://schemas.microsoft.com/office/drawing/2015/10/21/chartex" xmlns:cx3="http://schemas.microsoft.com/office/drawing/2016/5/9/chartex" xmlns:cx4="http://schemas.microsoft.com/office/drawing/2016/5/10/chartex" xmlns:cx5="http://schemas.microsoft.com/office/drawing/2016/5/11/chartex" xmlns:cx6="http://schemas.microsoft.com/office/drawing/2016/5/12/chartex" xmlns:cx7="http://schemas.microsoft.com/office/drawing/2016/5/13/chartex" xmlns:cx8="http://schemas.microsoft.com/office/drawing/2016/5/14/chartex" xmlns:mc="http://schemas.openxmlformats.org/markup-compatibility/2006" xmlns:aink="http://schemas.microsoft.com/office/drawing/2016/ink" xmlns:am3d="http://schemas.microsoft.com/office/drawing/2017/model3d" xmlns:o="urn:schemas-microsoft-com:office:office" xmlns:oel="http://schemas.microsoft.com/office/2019/extlst" xmlns:r="http://schemas.openxmlformats.org/officeDocument/2006/relationships" xmlns:m="http://schemas.openxmlformats.org/officeDocument/2006/math" xmlns:v="urn:schemas-microsoft-com:vml" xmlns:wp14="http://schemas.microsoft.com/office/word/2010/wordprocessingDrawing" xmlns:wp="http://schemas.openxmlformats.org/drawingml/2006/wordprocessingDrawing" xmlns:w10="urn:schemas-microsoft-com:office:word" xmlns:w="http://schemas.openxmlformats.org/wordprocessingml/2006/main" xmlns:w14="http://schemas.microsoft.com/office/word/2010/wordml" xmlns:w15="http://schemas.microsoft.com/office/word/2012/wordml" xmlns:w16cex="http://schemas.microsoft.com/office/word/2018/wordml/cex" xmlns:w16cid="http://schemas.microsoft.com/office/word/2016/wordml/cid" xmlns:w16="http://schemas.microsoft.com/office/word/2018/wordml" xmlns:w16du="http://schemas.microsoft.com/office/word/2023/wordml/word16du" xmlns:w16sdtdh="http://schemas.microsoft.com/office/word/2020/wordml/sdtdatahash" xmlns:w16sdtfl="http://schemas.microsoft.com/office/word/2024/wordml/sdtformatlock" xmlns:w16se="http://schemas.microsoft.com/office/word/2015/wordml/symex" xmlns:wpg="http://schemas.microsoft.com/office/word/2010/wordprocessingGroup" xmlns:wpi="http://schemas.microsoft.com/office/word/2010/wordprocessingInk" xmlns:wne="http://schemas.microsoft.com/office/word/2006/wordml" xmlns:wps="http://schemas.microsoft.com/office/word/2010/wordprocessingShape" mc:Ignorable="w14 w15 w16se w16cid w16 w16cex w16sdtdh w16sdtfl w16du wp14">
-  <w:p>
-    <w:pPr>
-      <w:pStyle w:val="a4"/>
-    </w:pPr>
-  </w:p>
-</w:ftr>
-</file>
-
 <file path=word/footnotes.xml><?xml version="1.0" encoding="utf-8"?>
 <w:footnotes xmlns:wpc="http://schemas.microsoft.com/office/word/2010/wordprocessingCanvas" xmlns:cx="http://schemas.microsoft.com/office/drawing/2014/chartex" xmlns:cx1="http://schemas.microsoft.com/office/drawing/2015/9/8/chartex" xmlns:cx2="http://schemas.microsoft.com/office/drawing/2015/10/21/chartex" xmlns:cx3="http://schemas.microsoft.com/office/drawing/2016/5/9/chartex" xmlns:cx4="http://schemas.microsoft.com/office/drawing/2016/5/10/chartex" xmlns:cx5="http://schemas.microsoft.com/office/drawing/2016/5/11/chartex" xmlns:cx6="http://schemas.microsoft.com/office/drawing/2016/5/12/chartex" xmlns:cx7="http://schemas.microsoft.com/office/drawing/2016/5/13/chartex" xmlns:cx8="http://schemas.microsoft.com/office/drawing/2016/5/14/chartex" xmlns:mc="http://schemas.openxmlformats.org/markup-compatibility/2006" xmlns:aink="http://schemas.microsoft.com/office/drawing/2016/ink" xmlns:am3d="http://schemas.microsoft.com/office/drawing/2017/model3d" xmlns:o="urn:schemas-microsoft-com:office:office" xmlns:oel="http://schemas.microsoft.com/office/2019/extlst" xmlns:r="http://schemas.openxmlformats.org/officeDocument/2006/relationships" xmlns:m="http://schemas.openxmlformats.org/officeDocument/2006/math" xmlns:v="urn:schemas-microsoft-com:vml" xmlns:wp14="http://schemas.microsoft.com/office/word/2010/wordprocessingDrawing" xmlns:wp="http://schemas.openxmlformats.org/drawingml/2006/wordprocessingDrawing" xmlns:w10="urn:schemas-microsoft-com:office:word" xmlns:w="http://schemas.openxmlformats.org/wordprocessingml/2006/main" xmlns:w14="http://schemas.microsoft.com/office/word/2010/wordml" xmlns:w15="http://schemas.microsoft.com/office/word/2012/wordml" xmlns:w16cex="http://schemas.microsoft.com/office/word/2018/wordml/cex" xmlns:w16cid="http://schemas.microsoft.com/office/word/2016/wordml/cid" xmlns:w16="http://schemas.microsoft.com/office/word/2018/wordml" xmlns:w16du="http://schemas.microsoft.com/office/word/2023/wordml/word16du" xmlns:w16sdtdh="http://schemas.microsoft.com/office/word/2020/wordml/sdtdatahash" xmlns:w16sdtfl="http://schemas.microsoft.com/office/word/2024/wordml/sdtformatlock" xmlns:w16se="http://schemas.microsoft.com/office/word/2015/wordml/symex" xmlns:wpg="http://schemas.microsoft.com/office/word/2010/wordprocessingGroup" xmlns:wpi="http://schemas.microsoft.com/office/word/2010/wordprocessingInk" xmlns:wne="http://schemas.microsoft.com/office/word/2006/wordml" xmlns:wps="http://schemas.microsoft.com/office/word/2010/wordprocessingShape" mc:Ignorable="w14 w15 w16se w16cid w16 w16cex w16sdtdh w16sdtfl w16du wp14">
   <w:footnote w:type="separator" w:id="-1">
@@ -15505,16 +15868,6 @@
 </file>
 
 <file path=word/header1.xml><?xml version="1.0" encoding="utf-8"?>
-<w:hdr xmlns:wpc="http://schemas.microsoft.com/office/word/2010/wordprocessingCanvas" xmlns:cx="http://schemas.microsoft.com/office/drawing/2014/chartex" xmlns:cx1="http://schemas.microsoft.com/office/drawing/2015/9/8/chartex" xmlns:cx2="http://schemas.microsoft.com/office/drawing/2015/10/21/chartex" xmlns:cx3="http://schemas.microsoft.com/office/drawing/2016/5/9/chartex" xmlns:cx4="http://schemas.microsoft.com/office/drawing/2016/5/10/chartex" xmlns:cx5="http://schemas.microsoft.com/office/drawing/2016/5/11/chartex" xmlns:cx6="http://schemas.microsoft.com/office/drawing/2016/5/12/chartex" xmlns:cx7="http://schemas.microsoft.com/office/drawing/2016/5/13/chartex" xmlns:cx8="http://schemas.microsoft.com/office/drawing/2016/5/14/chartex" xmlns:mc="http://schemas.openxmlformats.org/markup-compatibility/2006" xmlns:aink="http://schemas.microsoft.com/office/drawing/2016/ink" xmlns:am3d="http://schemas.microsoft.com/office/drawing/2017/model3d" xmlns:o="urn:schemas-microsoft-com:office:office" xmlns:oel="http://schemas.microsoft.com/office/2019/extlst" xmlns:r="http://schemas.openxmlformats.org/officeDocument/2006/relationships" xmlns:m="http://schemas.openxmlformats.org/officeDocument/2006/math" xmlns:v="urn:schemas-microsoft-com:vml" xmlns:wp14="http://schemas.microsoft.com/office/word/2010/wordprocessingDrawing" xmlns:wp="http://schemas.openxmlformats.org/drawingml/2006/wordprocessingDrawing" xmlns:w10="urn:schemas-microsoft-com:office:word" xmlns:w="http://schemas.openxmlformats.org/wordprocessingml/2006/main" xmlns:w14="http://schemas.microsoft.com/office/word/2010/wordml" xmlns:w15="http://schemas.microsoft.com/office/word/2012/wordml" xmlns:w16cex="http://schemas.microsoft.com/office/word/2018/wordml/cex" xmlns:w16cid="http://schemas.microsoft.com/office/word/2016/wordml/cid" xmlns:w16="http://schemas.microsoft.com/office/word/2018/wordml" xmlns:w16du="http://schemas.microsoft.com/office/word/2023/wordml/word16du" xmlns:w16sdtdh="http://schemas.microsoft.com/office/word/2020/wordml/sdtdatahash" xmlns:w16sdtfl="http://schemas.microsoft.com/office/word/2024/wordml/sdtformatlock" xmlns:w16se="http://schemas.microsoft.com/office/word/2015/wordml/symex" xmlns:wpg="http://schemas.microsoft.com/office/word/2010/wordprocessingGroup" xmlns:wpi="http://schemas.microsoft.com/office/word/2010/wordprocessingInk" xmlns:wne="http://schemas.microsoft.com/office/word/2006/wordml" xmlns:wps="http://schemas.microsoft.com/office/word/2010/wordprocessingShape" mc:Ignorable="w14 w15 w16se w16cid w16 w16cex w16sdtdh w16sdtfl w16du wp14">
-  <w:p>
-    <w:pPr>
-      <w:pStyle w:val="a6"/>
-    </w:pPr>
-  </w:p>
-</w:hdr>
-</file>
-
-<file path=word/header2.xml><?xml version="1.0" encoding="utf-8"?>
 <w:hdr xmlns:wpc="http://schemas.microsoft.com/office/word/2010/wordprocessingCanvas" xmlns:cx="http://schemas.microsoft.com/office/drawing/2014/chartex" xmlns:cx1="http://schemas.microsoft.com/office/drawing/2015/9/8/chartex" xmlns:cx2="http://schemas.microsoft.com/office/drawing/2015/10/21/chartex" xmlns:cx3="http://schemas.microsoft.com/office/drawing/2016/5/9/chartex" xmlns:cx4="http://schemas.microsoft.com/office/drawing/2016/5/10/chartex" xmlns:cx5="http://schemas.microsoft.com/office/drawing/2016/5/11/chartex" xmlns:cx6="http://schemas.microsoft.com/office/drawing/2016/5/12/chartex" xmlns:cx7="http://schemas.microsoft.com/office/drawing/2016/5/13/chartex" xmlns:cx8="http://schemas.microsoft.com/office/drawing/2016/5/14/chartex" xmlns:mc="http://schemas.openxmlformats.org/markup-compatibility/2006" xmlns:aink="http://schemas.microsoft.com/office/drawing/2016/ink" xmlns:am3d="http://schemas.microsoft.com/office/drawing/2017/model3d" xmlns:o="urn:schemas-microsoft-com:office:office" xmlns:oel="http://schemas.microsoft.com/office/2019/extlst" xmlns:r="http://schemas.openxmlformats.org/officeDocument/2006/relationships" xmlns:m="http://schemas.openxmlformats.org/officeDocument/2006/math" xmlns:v="urn:schemas-microsoft-com:vml" xmlns:wp14="http://schemas.microsoft.com/office/word/2010/wordprocessingDrawing" xmlns:wp="http://schemas.openxmlformats.org/drawingml/2006/wordprocessingDrawing" xmlns:w10="urn:schemas-microsoft-com:office:word" xmlns:w="http://schemas.openxmlformats.org/wordprocessingml/2006/main" xmlns:w14="http://schemas.microsoft.com/office/word/2010/wordml" xmlns:w15="http://schemas.microsoft.com/office/word/2012/wordml" xmlns:w16cex="http://schemas.microsoft.com/office/word/2018/wordml/cex" xmlns:w16cid="http://schemas.microsoft.com/office/word/2016/wordml/cid" xmlns:w16="http://schemas.microsoft.com/office/word/2018/wordml" xmlns:w16du="http://schemas.microsoft.com/office/word/2023/wordml/word16du" xmlns:w16sdtdh="http://schemas.microsoft.com/office/word/2020/wordml/sdtdatahash" xmlns:w16sdtfl="http://schemas.microsoft.com/office/word/2024/wordml/sdtformatlock" xmlns:w16se="http://schemas.microsoft.com/office/word/2015/wordml/symex" xmlns:wpg="http://schemas.microsoft.com/office/word/2010/wordprocessingGroup" xmlns:wpi="http://schemas.microsoft.com/office/word/2010/wordprocessingInk" xmlns:wne="http://schemas.microsoft.com/office/word/2006/wordml" xmlns:wps="http://schemas.microsoft.com/office/word/2010/wordprocessingShape" mc:Ignorable="w14 w15 w16se w16cid w16 w16cex w16sdtdh w16sdtfl w16du wp14">
   <w:p>
     <w:pPr>
@@ -15569,16 +15922,6 @@
     </w:r>
     <w:proofErr w:type="spellEnd"/>
     <w:proofErr w:type="gramEnd"/>
-  </w:p>
-</w:hdr>
-</file>
-
-<file path=word/header3.xml><?xml version="1.0" encoding="utf-8"?>
-<w:hdr xmlns:wpc="http://schemas.microsoft.com/office/word/2010/wordprocessingCanvas" xmlns:cx="http://schemas.microsoft.com/office/drawing/2014/chartex" xmlns:cx1="http://schemas.microsoft.com/office/drawing/2015/9/8/chartex" xmlns:cx2="http://schemas.microsoft.com/office/drawing/2015/10/21/chartex" xmlns:cx3="http://schemas.microsoft.com/office/drawing/2016/5/9/chartex" xmlns:cx4="http://schemas.microsoft.com/office/drawing/2016/5/10/chartex" xmlns:cx5="http://schemas.microsoft.com/office/drawing/2016/5/11/chartex" xmlns:cx6="http://schemas.microsoft.com/office/drawing/2016/5/12/chartex" xmlns:cx7="http://schemas.microsoft.com/office/drawing/2016/5/13/chartex" xmlns:cx8="http://schemas.microsoft.com/office/drawing/2016/5/14/chartex" xmlns:mc="http://schemas.openxmlformats.org/markup-compatibility/2006" xmlns:aink="http://schemas.microsoft.com/office/drawing/2016/ink" xmlns:am3d="http://schemas.microsoft.com/office/drawing/2017/model3d" xmlns:o="urn:schemas-microsoft-com:office:office" xmlns:oel="http://schemas.microsoft.com/office/2019/extlst" xmlns:r="http://schemas.openxmlformats.org/officeDocument/2006/relationships" xmlns:m="http://schemas.openxmlformats.org/officeDocument/2006/math" xmlns:v="urn:schemas-microsoft-com:vml" xmlns:wp14="http://schemas.microsoft.com/office/word/2010/wordprocessingDrawing" xmlns:wp="http://schemas.openxmlformats.org/drawingml/2006/wordprocessingDrawing" xmlns:w10="urn:schemas-microsoft-com:office:word" xmlns:w="http://schemas.openxmlformats.org/wordprocessingml/2006/main" xmlns:w14="http://schemas.microsoft.com/office/word/2010/wordml" xmlns:w15="http://schemas.microsoft.com/office/word/2012/wordml" xmlns:w16cex="http://schemas.microsoft.com/office/word/2018/wordml/cex" xmlns:w16cid="http://schemas.microsoft.com/office/word/2016/wordml/cid" xmlns:w16="http://schemas.microsoft.com/office/word/2018/wordml" xmlns:w16du="http://schemas.microsoft.com/office/word/2023/wordml/word16du" xmlns:w16sdtdh="http://schemas.microsoft.com/office/word/2020/wordml/sdtdatahash" xmlns:w16sdtfl="http://schemas.microsoft.com/office/word/2024/wordml/sdtformatlock" xmlns:w16se="http://schemas.microsoft.com/office/word/2015/wordml/symex" xmlns:wpg="http://schemas.microsoft.com/office/word/2010/wordprocessingGroup" xmlns:wpi="http://schemas.microsoft.com/office/word/2010/wordprocessingInk" xmlns:wne="http://schemas.microsoft.com/office/word/2006/wordml" xmlns:wps="http://schemas.microsoft.com/office/word/2010/wordprocessingShape" mc:Ignorable="w14 w15 w16se w16cid w16 w16cex w16sdtdh w16sdtfl w16du wp14">
-  <w:p>
-    <w:pPr>
-      <w:pStyle w:val="a6"/>
-    </w:pPr>
   </w:p>
 </w:hdr>
 </file>
@@ -17780,6 +18123,7 @@
   <w:style w:type="character" w:default="1" w:styleId="a1">
     <w:name w:val="Default Paragraph Font"/>
     <w:uiPriority w:val="1"/>
+    <w:semiHidden/>
     <w:unhideWhenUsed/>
   </w:style>
   <w:style w:type="table" w:default="1" w:styleId="a2">
@@ -18599,10 +18943,6 @@
 </file>
 
 <file path=customXml/item1.xml><?xml version="1.0" encoding="utf-8"?>
-<b:Sources xmlns:b="http://schemas.openxmlformats.org/officeDocument/2006/bibliography" xmlns="http://schemas.openxmlformats.org/officeDocument/2006/bibliography" SelectedStyle="\APASixthEditionOfficeOnline.xsl" StyleName="APA" Version="6"/>
-</file>
-
-<file path=customXml/item2.xml><?xml version="1.0" encoding="utf-8"?>
 <s:customData xmlns="http://www.wps.cn/officeDocument/2013/wpsCustomData" xmlns:s="http://www.wps.cn/officeDocument/2013/wpsCustomData">
   <customSectProps/>
   <customShpExts>
@@ -18611,18 +18951,22 @@
 </s:customData>
 </file>
 
+<file path=customXml/item2.xml><?xml version="1.0" encoding="utf-8"?>
+<b:Sources xmlns:b="http://schemas.openxmlformats.org/officeDocument/2006/bibliography" xmlns="http://schemas.openxmlformats.org/officeDocument/2006/bibliography" SelectedStyle="\APASixthEditionOfficeOnline.xsl" StyleName="APA" Version="6"/>
+</file>
+
 <file path=customXml/itemProps1.xml><?xml version="1.0" encoding="utf-8"?>
+<ds:datastoreItem xmlns:ds="http://schemas.openxmlformats.org/officeDocument/2006/customXml" ds:itemID="{B1977F7D-205B-4081-913C-38D41E755F92}">
+  <ds:schemaRefs>
+    <ds:schemaRef ds:uri="http://www.wps.cn/officeDocument/2013/wpsCustomData"/>
+  </ds:schemaRefs>
+</ds:datastoreItem>
+</file>
+
+<file path=customXml/itemProps2.xml><?xml version="1.0" encoding="utf-8"?>
 <ds:datastoreItem xmlns:ds="http://schemas.openxmlformats.org/officeDocument/2006/customXml" ds:itemID="{A3C42FEF-274B-4BDA-8559-31DB942021F2}">
   <ds:schemaRefs>
     <ds:schemaRef ds:uri="http://schemas.openxmlformats.org/officeDocument/2006/bibliography"/>
   </ds:schemaRefs>
 </ds:datastoreItem>
-</file>
-
-<file path=customXml/itemProps2.xml><?xml version="1.0" encoding="utf-8"?>
-<ds:datastoreItem xmlns:ds="http://schemas.openxmlformats.org/officeDocument/2006/customXml" ds:itemID="{B1977F7D-205B-4081-913C-38D41E755F92}">
-  <ds:schemaRefs>
-    <ds:schemaRef ds:uri="http://www.wps.cn/officeDocument/2013/wpsCustomData"/>
-  </ds:schemaRefs>
-</ds:datastoreItem>
 </file>
</xml_diff>